<commit_message>
Revisi Laporan TA dari Dosen Pembimbing 2
</commit_message>
<xml_diff>
--- a/Dokumen Laporan Skripsi/TA Skripsi - 202210370311094 - M. Heykal Dhafariel Rajendra.docx
+++ b/Dokumen Laporan Skripsi/TA Skripsi - 202210370311094 - M. Heykal Dhafariel Rajendra.docx
@@ -8993,14 +8993,12 @@
         </w:rPr>
         <w:br w:type="page"/>
       </w:r>
-      <w:bookmarkStart w:id="11" w:name="_GoBack"/>
-      <w:bookmarkEnd w:id="11"/>
     </w:p>
     <w:p>
       <w:pPr>
         <w:pStyle w:val="Heading1"/>
       </w:pPr>
-      <w:bookmarkStart w:id="12" w:name="_Toc234966988"/>
+      <w:bookmarkStart w:id="11" w:name="_Toc234966988"/>
       <w:r>
         <w:lastRenderedPageBreak/>
         <w:t>D</w:t>
@@ -9008,7 +9006,7 @@
       <w:r>
         <w:t>AFTAR GAMBAR</w:t>
       </w:r>
-      <w:bookmarkEnd w:id="12"/>
+      <w:bookmarkEnd w:id="11"/>
     </w:p>
     <w:p>
       <w:pPr>
@@ -9663,12 +9661,12 @@
       <w:pPr>
         <w:pStyle w:val="Heading1"/>
       </w:pPr>
-      <w:bookmarkStart w:id="13" w:name="_Toc234966989"/>
+      <w:bookmarkStart w:id="12" w:name="_Toc234966989"/>
       <w:r>
         <w:lastRenderedPageBreak/>
         <w:t>DAFTAR TABEL</w:t>
       </w:r>
-      <w:bookmarkEnd w:id="13"/>
+      <w:bookmarkEnd w:id="12"/>
     </w:p>
     <w:p>
       <w:pPr>
@@ -11447,12 +11445,12 @@
       <w:pPr>
         <w:pStyle w:val="Heading1"/>
       </w:pPr>
-      <w:bookmarkStart w:id="14" w:name="_Toc234966990"/>
+      <w:bookmarkStart w:id="13" w:name="_Toc234966990"/>
       <w:r>
         <w:lastRenderedPageBreak/>
         <w:t>DAFTAR RUMUS</w:t>
       </w:r>
-      <w:bookmarkEnd w:id="14"/>
+      <w:bookmarkEnd w:id="13"/>
     </w:p>
     <w:p>
       <w:pPr>
@@ -11683,7 +11681,7 @@
       <w:pPr>
         <w:pStyle w:val="Heading1"/>
       </w:pPr>
-      <w:bookmarkStart w:id="15" w:name="_Toc234966991"/>
+      <w:bookmarkStart w:id="14" w:name="_Toc234966991"/>
       <w:r>
         <w:lastRenderedPageBreak/>
         <w:t xml:space="preserve">BAB </w:t>
@@ -11694,7 +11692,7 @@
       <w:r>
         <w:t xml:space="preserve"> PENDAHULUAN</w:t>
       </w:r>
-      <w:bookmarkEnd w:id="15"/>
+      <w:bookmarkEnd w:id="14"/>
     </w:p>
     <w:p>
       <w:pPr>
@@ -11705,11 +11703,11 @@
         </w:numPr>
         <w:spacing w:before="240" w:line="360" w:lineRule="auto"/>
       </w:pPr>
-      <w:bookmarkStart w:id="16" w:name="_Toc234966992"/>
+      <w:bookmarkStart w:id="15" w:name="_Toc234966992"/>
       <w:r>
         <w:t>Latar Belakang</w:t>
       </w:r>
-      <w:bookmarkEnd w:id="16"/>
+      <w:bookmarkEnd w:id="15"/>
     </w:p>
     <w:p>
       <w:pPr>
@@ -11846,12 +11844,12 @@
         </w:numPr>
         <w:spacing w:line="360" w:lineRule="auto"/>
       </w:pPr>
-      <w:bookmarkStart w:id="17" w:name="_Toc234966993"/>
+      <w:bookmarkStart w:id="16" w:name="_Toc234966993"/>
       <w:r>
         <w:lastRenderedPageBreak/>
         <w:t>Rumusan Masalah</w:t>
       </w:r>
-      <w:bookmarkEnd w:id="17"/>
+      <w:bookmarkEnd w:id="16"/>
     </w:p>
     <w:p>
       <w:pPr>
@@ -11913,11 +11911,11 @@
         </w:numPr>
         <w:spacing w:line="360" w:lineRule="auto"/>
       </w:pPr>
-      <w:bookmarkStart w:id="18" w:name="_Toc234966994"/>
+      <w:bookmarkStart w:id="17" w:name="_Toc234966994"/>
       <w:r>
         <w:t>Tujuan Penelitian</w:t>
       </w:r>
-      <w:bookmarkEnd w:id="18"/>
+      <w:bookmarkEnd w:id="17"/>
     </w:p>
     <w:p>
       <w:pPr>
@@ -11979,11 +11977,11 @@
         </w:numPr>
         <w:spacing w:line="360" w:lineRule="auto"/>
       </w:pPr>
-      <w:bookmarkStart w:id="19" w:name="_Toc234966995"/>
+      <w:bookmarkStart w:id="18" w:name="_Toc234966995"/>
       <w:r>
         <w:t>Batasan Penelitian</w:t>
       </w:r>
-      <w:bookmarkEnd w:id="19"/>
+      <w:bookmarkEnd w:id="18"/>
     </w:p>
     <w:p>
       <w:pPr>
@@ -12151,12 +12149,12 @@
       <w:pPr>
         <w:pStyle w:val="Heading1"/>
       </w:pPr>
-      <w:bookmarkStart w:id="20" w:name="_Toc234966996"/>
+      <w:bookmarkStart w:id="19" w:name="_Toc234966996"/>
       <w:r>
         <w:lastRenderedPageBreak/>
         <w:t>BAB II TINJAUAN PUSTAKA</w:t>
       </w:r>
-      <w:bookmarkEnd w:id="20"/>
+      <w:bookmarkEnd w:id="19"/>
     </w:p>
     <w:p>
       <w:pPr>
@@ -12170,14 +12168,14 @@
           <w:lang w:val="en-US"/>
         </w:rPr>
       </w:pPr>
-      <w:bookmarkStart w:id="21" w:name="_Toc234966997"/>
+      <w:bookmarkStart w:id="20" w:name="_Toc234966997"/>
       <w:r>
         <w:rPr>
           <w:lang w:val="en-US"/>
         </w:rPr>
         <w:t>Tinjauan Pustaka</w:t>
       </w:r>
-      <w:bookmarkEnd w:id="21"/>
+      <w:bookmarkEnd w:id="20"/>
     </w:p>
     <w:p>
       <w:pPr>
@@ -12206,7 +12204,7 @@
           <w:szCs w:val="24"/>
         </w:rPr>
       </w:pPr>
-      <w:bookmarkStart w:id="22" w:name="_Toc230116341"/>
+      <w:bookmarkStart w:id="21" w:name="_Toc230116341"/>
       <w:r>
         <w:rPr>
           <w:b/>
@@ -12278,7 +12276,7 @@
         </w:rPr>
         <w:t xml:space="preserve"> Tinjauan Penelitian Terdahulu</w:t>
       </w:r>
-      <w:bookmarkEnd w:id="22"/>
+      <w:bookmarkEnd w:id="21"/>
     </w:p>
     <w:tbl>
       <w:tblPr>
@@ -12829,6 +12827,7 @@
                 <w:color w:val="1F1F1F"/>
                 <w:bdr w:val="none" w:sz="0" w:space="0" w:color="auto" w:frame="1"/>
               </w:rPr>
+              <w:lastRenderedPageBreak/>
               <w:t>4</w:t>
             </w:r>
             <w:r>
@@ -13199,14 +13198,14 @@
           <w:lang w:val="en-US"/>
         </w:rPr>
       </w:pPr>
-      <w:bookmarkStart w:id="23" w:name="_Toc234966998"/>
+      <w:bookmarkStart w:id="22" w:name="_Toc234966998"/>
       <w:r>
         <w:rPr>
           <w:lang w:val="en-US"/>
         </w:rPr>
         <w:t>Landasan Teori</w:t>
       </w:r>
-      <w:bookmarkEnd w:id="23"/>
+      <w:bookmarkEnd w:id="22"/>
     </w:p>
     <w:p>
       <w:pPr>
@@ -13218,11 +13217,11 @@
         <w:spacing w:line="360" w:lineRule="auto"/>
         <w:ind w:left="426"/>
       </w:pPr>
-      <w:bookmarkStart w:id="24" w:name="_Toc234966999"/>
+      <w:bookmarkStart w:id="23" w:name="_Toc234966999"/>
       <w:r>
         <w:t>Manajemen Stok dan Pengadaan Material</w:t>
       </w:r>
-      <w:bookmarkEnd w:id="24"/>
+      <w:bookmarkEnd w:id="23"/>
     </w:p>
     <w:p>
       <w:pPr>
@@ -13243,14 +13242,14 @@
         <w:spacing w:line="360" w:lineRule="auto"/>
         <w:ind w:left="426"/>
       </w:pPr>
-      <w:bookmarkStart w:id="25" w:name="_Toc234967000"/>
+      <w:bookmarkStart w:id="24" w:name="_Toc234967000"/>
       <w:r>
         <w:t>Business Process Model and Notation</w:t>
       </w:r>
       <w:r>
         <w:t xml:space="preserve"> (BPMN)</w:t>
       </w:r>
-      <w:bookmarkEnd w:id="25"/>
+      <w:bookmarkEnd w:id="24"/>
     </w:p>
     <w:p>
       <w:pPr>
@@ -13345,7 +13344,7 @@
           <w:szCs w:val="24"/>
         </w:rPr>
       </w:pPr>
-      <w:bookmarkStart w:id="26" w:name="_Toc230116268"/>
+      <w:bookmarkStart w:id="25" w:name="_Toc230116268"/>
       <w:r>
         <w:rPr>
           <w:b/>
@@ -13417,7 +13416,7 @@
         </w:rPr>
         <w:t xml:space="preserve"> BPMN Proses Pengadaan Material As-Is</w:t>
       </w:r>
-      <w:bookmarkEnd w:id="26"/>
+      <w:bookmarkEnd w:id="25"/>
       <w:r>
         <w:rPr>
           <w:b/>
@@ -13487,12 +13486,12 @@
         <w:spacing w:line="360" w:lineRule="auto"/>
         <w:ind w:left="426"/>
       </w:pPr>
-      <w:bookmarkStart w:id="27" w:name="_Toc234967001"/>
+      <w:bookmarkStart w:id="26" w:name="_Toc234967001"/>
       <w:r>
         <w:lastRenderedPageBreak/>
         <w:t>Metode Personal Extreme Programming (PXP)</w:t>
       </w:r>
-      <w:bookmarkEnd w:id="27"/>
+      <w:bookmarkEnd w:id="26"/>
     </w:p>
     <w:p>
       <w:pPr>
@@ -13647,11 +13646,11 @@
         <w:spacing w:line="360" w:lineRule="auto"/>
         <w:ind w:left="426"/>
       </w:pPr>
-      <w:bookmarkStart w:id="28" w:name="_Toc234967002"/>
+      <w:bookmarkStart w:id="27" w:name="_Toc234967002"/>
       <w:r>
         <w:t>Unified Modeling Language (UML)</w:t>
       </w:r>
-      <w:bookmarkEnd w:id="28"/>
+      <w:bookmarkEnd w:id="27"/>
     </w:p>
     <w:p>
       <w:pPr>
@@ -13714,11 +13713,11 @@
         <w:spacing w:line="360" w:lineRule="auto"/>
         <w:ind w:left="426"/>
       </w:pPr>
-      <w:bookmarkStart w:id="29" w:name="_Toc234967003"/>
+      <w:bookmarkStart w:id="28" w:name="_Toc234967003"/>
       <w:r>
         <w:t>Prototipe (Prototyping)</w:t>
       </w:r>
-      <w:bookmarkEnd w:id="29"/>
+      <w:bookmarkEnd w:id="28"/>
     </w:p>
     <w:p>
       <w:pPr>
@@ -13739,11 +13738,11 @@
         <w:spacing w:line="360" w:lineRule="auto"/>
         <w:ind w:left="426"/>
       </w:pPr>
-      <w:bookmarkStart w:id="30" w:name="_Toc234967004"/>
+      <w:bookmarkStart w:id="29" w:name="_Toc234967004"/>
       <w:r>
         <w:t>Pengujian Kuantitatif dan User Acceptance Test (UAT)</w:t>
       </w:r>
-      <w:bookmarkEnd w:id="30"/>
+      <w:bookmarkEnd w:id="29"/>
     </w:p>
     <w:p>
       <w:pPr>
@@ -13875,7 +13874,7 @@
                 <w:iCs/>
               </w:rPr>
             </w:pPr>
-            <w:bookmarkStart w:id="31" w:name="_Toc234966826"/>
+            <w:bookmarkStart w:id="30" w:name="_Toc234966826"/>
             <w:r>
               <w:rPr>
                 <w:b/>
@@ -13924,7 +13923,7 @@
               </w:rPr>
               <w:t>)</w:t>
             </w:r>
-            <w:bookmarkEnd w:id="31"/>
+            <w:bookmarkEnd w:id="30"/>
           </w:p>
         </w:tc>
       </w:tr>
@@ -13981,12 +13980,12 @@
       <w:pPr>
         <w:pStyle w:val="Heading1"/>
       </w:pPr>
-      <w:bookmarkStart w:id="32" w:name="_Toc234967005"/>
+      <w:bookmarkStart w:id="31" w:name="_Toc234967005"/>
       <w:r>
         <w:lastRenderedPageBreak/>
         <w:t>BAB III METODOLOGI PENELITIAN</w:t>
       </w:r>
-      <w:bookmarkEnd w:id="32"/>
+      <w:bookmarkEnd w:id="31"/>
     </w:p>
     <w:p>
       <w:pPr>
@@ -14062,7 +14061,7 @@
           <w:szCs w:val="24"/>
         </w:rPr>
       </w:pPr>
-      <w:bookmarkStart w:id="33" w:name="_Toc233127915"/>
+      <w:bookmarkStart w:id="32" w:name="_Toc233127915"/>
       <w:r>
         <w:rPr>
           <w:b/>
@@ -14134,7 +14133,7 @@
         </w:rPr>
         <w:t xml:space="preserve"> Diagram Metodologi Penelitian</w:t>
       </w:r>
-      <w:bookmarkEnd w:id="33"/>
+      <w:bookmarkEnd w:id="32"/>
       <w:r>
         <w:rPr>
           <w:b/>
@@ -14174,14 +14173,14 @@
           <w:lang w:val="en-US"/>
         </w:rPr>
       </w:pPr>
-      <w:bookmarkStart w:id="34" w:name="_Toc234967006"/>
+      <w:bookmarkStart w:id="33" w:name="_Toc234967006"/>
       <w:r>
         <w:rPr>
           <w:lang w:val="en-US"/>
         </w:rPr>
         <w:t>Waktu dan Tempat Penelitian</w:t>
       </w:r>
-      <w:bookmarkEnd w:id="34"/>
+      <w:bookmarkEnd w:id="33"/>
     </w:p>
     <w:p>
       <w:pPr>
@@ -14231,7 +14230,7 @@
           <w:lang w:val="en-US"/>
         </w:rPr>
       </w:pPr>
-      <w:bookmarkStart w:id="35" w:name="_Toc234967007"/>
+      <w:bookmarkStart w:id="34" w:name="_Toc234967007"/>
       <w:r>
         <w:rPr>
           <w:rFonts w:eastAsia="Calibri"/>
@@ -14239,7 +14238,7 @@
         </w:rPr>
         <w:t>Alat dan Bahan</w:t>
       </w:r>
-      <w:bookmarkEnd w:id="35"/>
+      <w:bookmarkEnd w:id="34"/>
     </w:p>
     <w:p>
       <w:pPr>
@@ -14283,7 +14282,7 @@
           <w:lang w:val="en-US"/>
         </w:rPr>
       </w:pPr>
-      <w:bookmarkStart w:id="36" w:name="_Toc234967008"/>
+      <w:bookmarkStart w:id="35" w:name="_Toc234967008"/>
       <w:r>
         <w:rPr>
           <w:lang w:val="en-US"/>
@@ -14291,7 +14290,7 @@
         <w:lastRenderedPageBreak/>
         <w:t>Perangkat Keras (Hardware)</w:t>
       </w:r>
-      <w:bookmarkEnd w:id="36"/>
+      <w:bookmarkEnd w:id="35"/>
     </w:p>
     <w:p>
       <w:pPr>
@@ -14401,14 +14400,14 @@
           <w:lang w:val="en-US"/>
         </w:rPr>
       </w:pPr>
-      <w:bookmarkStart w:id="37" w:name="_Toc234967009"/>
+      <w:bookmarkStart w:id="36" w:name="_Toc234967009"/>
       <w:r>
         <w:rPr>
           <w:lang w:val="en-US"/>
         </w:rPr>
         <w:t>Perangkat Lunak (Software)</w:t>
       </w:r>
-      <w:bookmarkEnd w:id="37"/>
+      <w:bookmarkEnd w:id="36"/>
     </w:p>
     <w:p>
       <w:pPr>
@@ -14516,14 +14515,14 @@
           <w:lang w:val="en-US"/>
         </w:rPr>
       </w:pPr>
-      <w:bookmarkStart w:id="38" w:name="_Toc234967010"/>
+      <w:bookmarkStart w:id="37" w:name="_Toc234967010"/>
       <w:r>
         <w:rPr>
           <w:lang w:val="en-US"/>
         </w:rPr>
         <w:t>Metode Pengumpulan Data</w:t>
       </w:r>
-      <w:bookmarkEnd w:id="38"/>
+      <w:bookmarkEnd w:id="37"/>
     </w:p>
     <w:p>
       <w:pPr>
@@ -14667,14 +14666,14 @@
           <w:lang w:val="en-US"/>
         </w:rPr>
       </w:pPr>
-      <w:bookmarkStart w:id="39" w:name="_Toc234967011"/>
+      <w:bookmarkStart w:id="38" w:name="_Toc234967011"/>
       <w:r>
         <w:rPr>
           <w:lang w:val="en-US"/>
         </w:rPr>
         <w:t>Metode Pengembangan Sistem</w:t>
       </w:r>
-      <w:bookmarkEnd w:id="39"/>
+      <w:bookmarkEnd w:id="38"/>
     </w:p>
     <w:p>
       <w:pPr>
@@ -14761,7 +14760,7 @@
           <w:szCs w:val="24"/>
         </w:rPr>
       </w:pPr>
-      <w:bookmarkStart w:id="40" w:name="_Toc233127916"/>
+      <w:bookmarkStart w:id="39" w:name="_Toc233127916"/>
       <w:r>
         <w:rPr>
           <w:b/>
@@ -14833,7 +14832,7 @@
         </w:rPr>
         <w:t xml:space="preserve"> Diagram PXP</w:t>
       </w:r>
-      <w:bookmarkEnd w:id="40"/>
+      <w:bookmarkEnd w:id="39"/>
     </w:p>
     <w:p>
       <w:pPr>
@@ -14870,11 +14869,11 @@
         <w:spacing w:line="360" w:lineRule="auto"/>
         <w:ind w:left="426"/>
       </w:pPr>
-      <w:bookmarkStart w:id="41" w:name="_Toc234967012"/>
+      <w:bookmarkStart w:id="40" w:name="_Toc234967012"/>
       <w:r>
         <w:t>Requirements</w:t>
       </w:r>
-      <w:bookmarkEnd w:id="41"/>
+      <w:bookmarkEnd w:id="40"/>
     </w:p>
     <w:p>
       <w:pPr>
@@ -15206,11 +15205,11 @@
         <w:spacing w:line="360" w:lineRule="auto"/>
         <w:ind w:left="426"/>
       </w:pPr>
-      <w:bookmarkStart w:id="42" w:name="_Toc234967013"/>
+      <w:bookmarkStart w:id="41" w:name="_Toc234967013"/>
       <w:r>
         <w:t>Planning</w:t>
       </w:r>
-      <w:bookmarkEnd w:id="42"/>
+      <w:bookmarkEnd w:id="41"/>
     </w:p>
     <w:p>
       <w:pPr>
@@ -15360,11 +15359,11 @@
         <w:spacing w:line="360" w:lineRule="auto"/>
         <w:ind w:left="426"/>
       </w:pPr>
-      <w:bookmarkStart w:id="43" w:name="_Toc234967014"/>
+      <w:bookmarkStart w:id="42" w:name="_Toc234967014"/>
       <w:r>
         <w:t>Iteration Initialization</w:t>
       </w:r>
-      <w:bookmarkEnd w:id="43"/>
+      <w:bookmarkEnd w:id="42"/>
     </w:p>
     <w:p>
       <w:pPr>
@@ -15597,11 +15596,11 @@
         <w:spacing w:line="360" w:lineRule="auto"/>
         <w:ind w:left="426"/>
       </w:pPr>
-      <w:bookmarkStart w:id="44" w:name="_Toc234967015"/>
+      <w:bookmarkStart w:id="43" w:name="_Toc234967015"/>
       <w:r>
         <w:t>Design</w:t>
       </w:r>
-      <w:bookmarkEnd w:id="44"/>
+      <w:bookmarkEnd w:id="43"/>
     </w:p>
     <w:p>
       <w:pPr>
@@ -15756,11 +15755,11 @@
         <w:spacing w:line="360" w:lineRule="auto"/>
         <w:ind w:left="426"/>
       </w:pPr>
-      <w:bookmarkStart w:id="45" w:name="_Toc234967016"/>
+      <w:bookmarkStart w:id="44" w:name="_Toc234967016"/>
       <w:r>
         <w:t>Implementation</w:t>
       </w:r>
-      <w:bookmarkEnd w:id="45"/>
+      <w:bookmarkEnd w:id="44"/>
     </w:p>
     <w:p>
       <w:pPr>
@@ -15831,11 +15830,11 @@
         <w:spacing w:line="360" w:lineRule="auto"/>
         <w:ind w:left="426"/>
       </w:pPr>
-      <w:bookmarkStart w:id="46" w:name="_Toc234967017"/>
+      <w:bookmarkStart w:id="45" w:name="_Toc234967017"/>
       <w:r>
         <w:t>System Testing</w:t>
       </w:r>
-      <w:bookmarkEnd w:id="46"/>
+      <w:bookmarkEnd w:id="45"/>
     </w:p>
     <w:p>
       <w:pPr>
@@ -16163,12 +16162,12 @@
         <w:spacing w:line="360" w:lineRule="auto"/>
         <w:ind w:left="426"/>
       </w:pPr>
-      <w:bookmarkStart w:id="47" w:name="_Toc234967018"/>
+      <w:bookmarkStart w:id="46" w:name="_Toc234967018"/>
       <w:r>
         <w:lastRenderedPageBreak/>
         <w:t>Retrospective</w:t>
       </w:r>
-      <w:bookmarkEnd w:id="47"/>
+      <w:bookmarkEnd w:id="46"/>
     </w:p>
     <w:p>
       <w:pPr>
@@ -16331,11 +16330,11 @@
         </w:numPr>
         <w:spacing w:line="360" w:lineRule="auto"/>
       </w:pPr>
-      <w:bookmarkStart w:id="48" w:name="_Toc234967019"/>
+      <w:bookmarkStart w:id="47" w:name="_Toc234967019"/>
       <w:r>
         <w:t>Metode Pengujian User Acceptance Test (UAT)</w:t>
       </w:r>
-      <w:bookmarkEnd w:id="48"/>
+      <w:bookmarkEnd w:id="47"/>
     </w:p>
     <w:p>
       <w:pPr>
@@ -16356,12 +16355,12 @@
         <w:spacing w:line="360" w:lineRule="auto"/>
         <w:ind w:left="426"/>
       </w:pPr>
-      <w:bookmarkStart w:id="49" w:name="_Toc234967020"/>
+      <w:bookmarkStart w:id="48" w:name="_Toc234967020"/>
       <w:r>
         <w:lastRenderedPageBreak/>
         <w:t>Responden Penelitian</w:t>
       </w:r>
-      <w:bookmarkEnd w:id="49"/>
+      <w:bookmarkEnd w:id="48"/>
     </w:p>
     <w:p>
       <w:pPr>
@@ -16409,11 +16408,11 @@
         <w:spacing w:line="360" w:lineRule="auto"/>
         <w:ind w:left="426"/>
       </w:pPr>
-      <w:bookmarkStart w:id="50" w:name="_Toc234967021"/>
+      <w:bookmarkStart w:id="49" w:name="_Toc234967021"/>
       <w:r>
         <w:t>Instrumen Pengujian</w:t>
       </w:r>
-      <w:bookmarkEnd w:id="50"/>
+      <w:bookmarkEnd w:id="49"/>
     </w:p>
     <w:p>
       <w:pPr>
@@ -16609,11 +16608,11 @@
         <w:spacing w:line="360" w:lineRule="auto"/>
         <w:ind w:left="426"/>
       </w:pPr>
-      <w:bookmarkStart w:id="51" w:name="_Toc234967022"/>
+      <w:bookmarkStart w:id="50" w:name="_Toc234967022"/>
       <w:r>
         <w:t>Skenario Usability Testing</w:t>
       </w:r>
-      <w:bookmarkEnd w:id="51"/>
+      <w:bookmarkEnd w:id="50"/>
     </w:p>
     <w:p>
       <w:pPr>
@@ -16637,7 +16636,7 @@
           <w:szCs w:val="24"/>
         </w:rPr>
       </w:pPr>
-      <w:bookmarkStart w:id="52" w:name="_Toc234966709"/>
+      <w:bookmarkStart w:id="51" w:name="_Toc234966709"/>
       <w:r>
         <w:rPr>
           <w:b/>
@@ -16709,7 +16708,7 @@
         </w:rPr>
         <w:t xml:space="preserve"> Skenario Usability Testing</w:t>
       </w:r>
-      <w:bookmarkEnd w:id="52"/>
+      <w:bookmarkEnd w:id="51"/>
     </w:p>
     <w:tbl>
       <w:tblPr>
@@ -17126,7 +17125,7 @@
         <w:spacing w:line="360" w:lineRule="auto"/>
         <w:ind w:left="426"/>
       </w:pPr>
-      <w:bookmarkStart w:id="53" w:name="_Toc234967023"/>
+      <w:bookmarkStart w:id="52" w:name="_Toc234967023"/>
       <w:r>
         <w:lastRenderedPageBreak/>
         <w:t>Teknik Analisis Dat</w:t>
@@ -17134,7 +17133,7 @@
       <w:r>
         <w:t>a</w:t>
       </w:r>
-      <w:bookmarkEnd w:id="53"/>
+      <w:bookmarkEnd w:id="52"/>
     </w:p>
     <w:p>
       <w:pPr>
@@ -17257,7 +17256,7 @@
                 <w:iCs/>
               </w:rPr>
             </w:pPr>
-            <w:bookmarkStart w:id="54" w:name="_Toc234966827"/>
+            <w:bookmarkStart w:id="53" w:name="_Toc234966827"/>
             <w:r>
               <w:rPr>
                 <w:b/>
@@ -17306,7 +17305,7 @@
               </w:rPr>
               <w:t>)</w:t>
             </w:r>
-            <w:bookmarkEnd w:id="54"/>
+            <w:bookmarkEnd w:id="53"/>
           </w:p>
         </w:tc>
       </w:tr>
@@ -17372,12 +17371,12 @@
       <w:pPr>
         <w:pStyle w:val="Heading1"/>
       </w:pPr>
-      <w:bookmarkStart w:id="55" w:name="_Toc234967024"/>
+      <w:bookmarkStart w:id="54" w:name="_Toc234967024"/>
       <w:r>
         <w:lastRenderedPageBreak/>
         <w:t>BAB IV HASIL DAN PEMBAHASAN</w:t>
       </w:r>
-      <w:bookmarkEnd w:id="55"/>
+      <w:bookmarkEnd w:id="54"/>
     </w:p>
     <w:p>
       <w:pPr>
@@ -17389,11 +17388,11 @@
         <w:spacing w:line="360" w:lineRule="auto"/>
         <w:ind w:left="709" w:hanging="567"/>
       </w:pPr>
-      <w:bookmarkStart w:id="56" w:name="_Toc234967025"/>
+      <w:bookmarkStart w:id="55" w:name="_Toc234967025"/>
       <w:r>
         <w:t>Identifikasi Masalah</w:t>
       </w:r>
-      <w:bookmarkEnd w:id="56"/>
+      <w:bookmarkEnd w:id="55"/>
     </w:p>
     <w:p>
       <w:pPr>
@@ -17533,11 +17532,11 @@
         <w:spacing w:line="360" w:lineRule="auto"/>
         <w:ind w:hanging="578"/>
       </w:pPr>
-      <w:bookmarkStart w:id="57" w:name="_Toc234967026"/>
+      <w:bookmarkStart w:id="56" w:name="_Toc234967026"/>
       <w:r>
         <w:t>Pengumpulan Data  (Observasi dan Wawancara)</w:t>
       </w:r>
-      <w:bookmarkEnd w:id="57"/>
+      <w:bookmarkEnd w:id="56"/>
     </w:p>
     <w:p>
       <w:pPr>
@@ -17570,11 +17569,11 @@
         <w:spacing w:line="360" w:lineRule="auto"/>
         <w:ind w:hanging="578"/>
       </w:pPr>
-      <w:bookmarkStart w:id="58" w:name="_Toc234967027"/>
+      <w:bookmarkStart w:id="57" w:name="_Toc234967027"/>
       <w:r>
         <w:t>Identifikasi Stakeholder</w:t>
       </w:r>
-      <w:bookmarkEnd w:id="58"/>
+      <w:bookmarkEnd w:id="57"/>
     </w:p>
     <w:p>
       <w:pPr>
@@ -17618,7 +17617,7 @@
           <w:szCs w:val="24"/>
         </w:rPr>
       </w:pPr>
-      <w:bookmarkStart w:id="59" w:name="_Toc234966662"/>
+      <w:bookmarkStart w:id="58" w:name="_Toc234966662"/>
       <w:r>
         <w:rPr>
           <w:b/>
@@ -17683,7 +17682,7 @@
         </w:rPr>
         <w:t xml:space="preserve"> Identifikasi Stakeholder</w:t>
       </w:r>
-      <w:bookmarkEnd w:id="59"/>
+      <w:bookmarkEnd w:id="58"/>
     </w:p>
     <w:tbl>
       <w:tblPr>
@@ -17964,11 +17963,11 @@
         <w:spacing w:line="360" w:lineRule="auto"/>
         <w:ind w:hanging="578"/>
       </w:pPr>
-      <w:bookmarkStart w:id="60" w:name="_Toc234967028"/>
+      <w:bookmarkStart w:id="59" w:name="_Toc234967028"/>
       <w:r>
         <w:t>Observasi</w:t>
       </w:r>
-      <w:bookmarkEnd w:id="60"/>
+      <w:bookmarkEnd w:id="59"/>
     </w:p>
     <w:p>
       <w:pPr>
@@ -18087,7 +18086,7 @@
           <w:sz w:val="24"/>
         </w:rPr>
       </w:pPr>
-      <w:bookmarkStart w:id="61" w:name="_Toc234966663"/>
+      <w:bookmarkStart w:id="60" w:name="_Toc234966663"/>
       <w:r>
         <w:rPr>
           <w:b/>
@@ -18153,7 +18152,7 @@
         </w:rPr>
         <w:t xml:space="preserve"> Hasil Observasi Proses Operasional</w:t>
       </w:r>
-      <w:bookmarkEnd w:id="61"/>
+      <w:bookmarkEnd w:id="60"/>
     </w:p>
     <w:tbl>
       <w:tblPr>
@@ -18764,12 +18763,12 @@
         <w:spacing w:line="360" w:lineRule="auto"/>
         <w:ind w:hanging="720"/>
       </w:pPr>
-      <w:bookmarkStart w:id="62" w:name="_Toc234967029"/>
+      <w:bookmarkStart w:id="61" w:name="_Toc234967029"/>
       <w:r>
         <w:lastRenderedPageBreak/>
         <w:t>Wawancara</w:t>
       </w:r>
-      <w:bookmarkEnd w:id="62"/>
+      <w:bookmarkEnd w:id="61"/>
     </w:p>
     <w:p>
       <w:pPr>
@@ -18945,7 +18944,7 @@
           <w:sz w:val="24"/>
         </w:rPr>
       </w:pPr>
-      <w:bookmarkStart w:id="63" w:name="_Toc234966664"/>
+      <w:bookmarkStart w:id="62" w:name="_Toc234966664"/>
       <w:r>
         <w:rPr>
           <w:b/>
@@ -19010,7 +19009,7 @@
         </w:rPr>
         <w:t xml:space="preserve"> Hasil Wawancara Pemilik Usaha</w:t>
       </w:r>
-      <w:bookmarkEnd w:id="63"/>
+      <w:bookmarkEnd w:id="62"/>
     </w:p>
     <w:tbl>
       <w:tblPr>
@@ -19519,7 +19518,7 @@
           <w:sz w:val="24"/>
         </w:rPr>
       </w:pPr>
-      <w:bookmarkStart w:id="64" w:name="_Toc234966665"/>
+      <w:bookmarkStart w:id="63" w:name="_Toc234966665"/>
       <w:r>
         <w:rPr>
           <w:b/>
@@ -19584,7 +19583,7 @@
         </w:rPr>
         <w:t xml:space="preserve"> Hasil Wawancara Admin 1</w:t>
       </w:r>
-      <w:bookmarkEnd w:id="64"/>
+      <w:bookmarkEnd w:id="63"/>
     </w:p>
     <w:tbl>
       <w:tblPr>
@@ -20091,7 +20090,7 @@
           <w:sz w:val="24"/>
         </w:rPr>
       </w:pPr>
-      <w:bookmarkStart w:id="65" w:name="_Toc234966666"/>
+      <w:bookmarkStart w:id="64" w:name="_Toc234966666"/>
       <w:r>
         <w:rPr>
           <w:b/>
@@ -20156,7 +20155,7 @@
         </w:rPr>
         <w:t xml:space="preserve"> Hasil Wawancara Admin 2</w:t>
       </w:r>
-      <w:bookmarkEnd w:id="65"/>
+      <w:bookmarkEnd w:id="64"/>
     </w:p>
     <w:tbl>
       <w:tblPr>
@@ -20672,7 +20671,7 @@
           <w:sz w:val="24"/>
         </w:rPr>
       </w:pPr>
-      <w:bookmarkStart w:id="66" w:name="_Toc234966667"/>
+      <w:bookmarkStart w:id="65" w:name="_Toc234966667"/>
       <w:r>
         <w:rPr>
           <w:b/>
@@ -20737,7 +20736,7 @@
         </w:rPr>
         <w:t xml:space="preserve"> Hasil Wawancara Staf Gudang 1</w:t>
       </w:r>
-      <w:bookmarkEnd w:id="66"/>
+      <w:bookmarkEnd w:id="65"/>
     </w:p>
     <w:tbl>
       <w:tblPr>
@@ -21254,7 +21253,7 @@
           <w:sz w:val="24"/>
         </w:rPr>
       </w:pPr>
-      <w:bookmarkStart w:id="67" w:name="_Toc234966668"/>
+      <w:bookmarkStart w:id="66" w:name="_Toc234966668"/>
       <w:r>
         <w:rPr>
           <w:b/>
@@ -21319,7 +21318,7 @@
         </w:rPr>
         <w:t xml:space="preserve"> Hasil Wawancara Staf Gudang 2</w:t>
       </w:r>
-      <w:bookmarkEnd w:id="67"/>
+      <w:bookmarkEnd w:id="66"/>
     </w:p>
     <w:tbl>
       <w:tblPr>
@@ -21829,7 +21828,7 @@
           <w:sz w:val="24"/>
         </w:rPr>
       </w:pPr>
-      <w:bookmarkStart w:id="68" w:name="_Toc234966669"/>
+      <w:bookmarkStart w:id="67" w:name="_Toc234966669"/>
       <w:r>
         <w:rPr>
           <w:b/>
@@ -21894,7 +21893,7 @@
         </w:rPr>
         <w:t xml:space="preserve"> Hasil Wawancara Pengawas Lapangan</w:t>
       </w:r>
-      <w:bookmarkEnd w:id="68"/>
+      <w:bookmarkEnd w:id="67"/>
     </w:p>
     <w:tbl>
       <w:tblPr>
@@ -22408,7 +22407,7 @@
           <w:szCs w:val="24"/>
         </w:rPr>
       </w:pPr>
-      <w:bookmarkStart w:id="69" w:name="_Toc234966670"/>
+      <w:bookmarkStart w:id="68" w:name="_Toc234966670"/>
       <w:r>
         <w:rPr>
           <w:b/>
@@ -22481,7 +22480,7 @@
         </w:rPr>
         <w:t xml:space="preserve"> Proses Transformasi Hasil Wawancara Menjadi Kebutuhan Sistem</w:t>
       </w:r>
-      <w:bookmarkEnd w:id="69"/>
+      <w:bookmarkEnd w:id="68"/>
     </w:p>
     <w:tbl>
       <w:tblPr>
@@ -22930,6 +22929,7 @@
               <w:jc w:val="left"/>
             </w:pPr>
             <w:r>
+              <w:lastRenderedPageBreak/>
               <w:t>6</w:t>
             </w:r>
           </w:p>
@@ -22997,11 +22997,11 @@
         <w:spacing w:line="360" w:lineRule="auto"/>
         <w:ind w:hanging="578"/>
       </w:pPr>
-      <w:bookmarkStart w:id="70" w:name="_Toc234967030"/>
+      <w:bookmarkStart w:id="69" w:name="_Toc234967030"/>
       <w:r>
         <w:t>Analisis Kebutuhan Sistem</w:t>
       </w:r>
-      <w:bookmarkEnd w:id="70"/>
+      <w:bookmarkEnd w:id="69"/>
     </w:p>
     <w:p>
       <w:pPr>
@@ -23040,12 +23040,12 @@
         <w:spacing w:line="360" w:lineRule="auto"/>
         <w:ind w:hanging="720"/>
       </w:pPr>
-      <w:bookmarkStart w:id="71" w:name="_Toc234967031"/>
+      <w:bookmarkStart w:id="70" w:name="_Toc234967031"/>
       <w:r>
         <w:lastRenderedPageBreak/>
         <w:t>Kebutuhan Fungsional</w:t>
       </w:r>
-      <w:bookmarkEnd w:id="71"/>
+      <w:bookmarkEnd w:id="70"/>
     </w:p>
     <w:p>
       <w:pPr>
@@ -23114,7 +23114,7 @@
           <w:szCs w:val="24"/>
         </w:rPr>
       </w:pPr>
-      <w:bookmarkStart w:id="72" w:name="_Toc234966671"/>
+      <w:bookmarkStart w:id="71" w:name="_Toc234966671"/>
       <w:r>
         <w:rPr>
           <w:b/>
@@ -23187,7 +23187,7 @@
         </w:rPr>
         <w:t xml:space="preserve"> Kebutuhan Fungsional Sistem</w:t>
       </w:r>
-      <w:bookmarkEnd w:id="72"/>
+      <w:bookmarkEnd w:id="71"/>
     </w:p>
     <w:tbl>
       <w:tblPr>
@@ -23806,12 +23806,12 @@
         <w:spacing w:line="360" w:lineRule="auto"/>
         <w:ind w:hanging="720"/>
       </w:pPr>
-      <w:bookmarkStart w:id="73" w:name="_Toc234967032"/>
+      <w:bookmarkStart w:id="72" w:name="_Toc234967032"/>
       <w:r>
         <w:lastRenderedPageBreak/>
         <w:t>Kebutuhan Non-Fungsional</w:t>
       </w:r>
-      <w:bookmarkEnd w:id="73"/>
+      <w:bookmarkEnd w:id="72"/>
     </w:p>
     <w:p>
       <w:pPr>
@@ -23853,7 +23853,7 @@
           <w:szCs w:val="24"/>
         </w:rPr>
       </w:pPr>
-      <w:bookmarkStart w:id="74" w:name="_Toc234966672"/>
+      <w:bookmarkStart w:id="73" w:name="_Toc234966672"/>
       <w:r>
         <w:rPr>
           <w:b/>
@@ -23925,7 +23925,7 @@
         </w:rPr>
         <w:t xml:space="preserve"> Kebutuhan Non-Fungsional Sistem</w:t>
       </w:r>
-      <w:bookmarkEnd w:id="74"/>
+      <w:bookmarkEnd w:id="73"/>
     </w:p>
     <w:tbl>
       <w:tblPr>
@@ -24345,11 +24345,11 @@
         <w:spacing w:line="360" w:lineRule="auto"/>
         <w:ind w:left="709" w:hanging="709"/>
       </w:pPr>
-      <w:bookmarkStart w:id="75" w:name="_Toc234967033"/>
+      <w:bookmarkStart w:id="74" w:name="_Toc234967033"/>
       <w:r>
         <w:t>Analisis Aktor Sistem</w:t>
       </w:r>
-      <w:bookmarkEnd w:id="75"/>
+      <w:bookmarkEnd w:id="74"/>
     </w:p>
     <w:p>
       <w:pPr>
@@ -24387,7 +24387,7 @@
           <w:szCs w:val="24"/>
         </w:rPr>
       </w:pPr>
-      <w:bookmarkStart w:id="76" w:name="_Toc234966673"/>
+      <w:bookmarkStart w:id="75" w:name="_Toc234966673"/>
       <w:r>
         <w:rPr>
           <w:b/>
@@ -24459,7 +24459,7 @@
         </w:rPr>
         <w:t xml:space="preserve"> Proses Transformasi Hasil Wawancara Menjadi Aktor Sistem</w:t>
       </w:r>
-      <w:bookmarkEnd w:id="76"/>
+      <w:bookmarkEnd w:id="75"/>
     </w:p>
     <w:tbl>
       <w:tblPr>
@@ -24821,6 +24821,11 @@
         <w:t>3</w:t>
       </w:r>
       <w:r>
+        <w:t xml:space="preserve"> Analisis Aktor Sistem</w:t>
+      </w:r>
+      <w:bookmarkStart w:id="76" w:name="_GoBack"/>
+      <w:bookmarkEnd w:id="76"/>
+      <w:r>
         <w:t>.</w:t>
       </w:r>
     </w:p>
@@ -25328,13 +25333,7 @@
         <w:ind w:firstLine="720"/>
       </w:pPr>
       <w:r>
-        <w:t>Proses transformasi hasil wawancara menjadi user story disajikan pada Tabel 4.1</w:t>
-      </w:r>
-      <w:r>
-        <w:t>4</w:t>
-      </w:r>
-      <w:r>
-        <w:t>.</w:t>
+        <w:t>Proses transformasi hasil wawancara menjadi user story disajikan pada Tabel 4.14.</w:t>
       </w:r>
     </w:p>
     <w:p>
@@ -28320,13 +28319,7 @@
         <w:ind w:firstLine="720"/>
       </w:pPr>
       <w:r>
-        <w:t>Selanjutnya, daftar prioritas fitur yang telah ditetapkan disajikan pada Tabel 4.1</w:t>
-      </w:r>
-      <w:r>
-        <w:t>8</w:t>
-      </w:r>
-      <w:r>
-        <w:t xml:space="preserve"> Prioritas Pengembangan Fitur.</w:t>
+        <w:t>Selanjutnya, daftar prioritas fitur yang telah ditetapkan disajikan pada Tabel 4.18 Prioritas Pengembangan Fitur.</w:t>
       </w:r>
     </w:p>
     <w:p>
@@ -29678,13 +29671,7 @@
         <w:ind w:firstLine="720"/>
       </w:pPr>
       <w:r>
-        <w:t>Hasil pembagian ruang lingkup iterasi selanjutnya disajikan pada Tabel 4.</w:t>
-      </w:r>
-      <w:r>
-        <w:t>20</w:t>
-      </w:r>
-      <w:r>
-        <w:t xml:space="preserve"> Ruang Lingkup Iterasi.</w:t>
+        <w:t>Hasil pembagian ruang lingkup iterasi selanjutnya disajikan pada Tabel 4.20 Ruang Lingkup Iterasi.</w:t>
       </w:r>
     </w:p>
     <w:p>
@@ -40842,7 +40829,7 @@
 </file>
 
 <file path=customXml/itemProps1.xml><?xml version="1.0" encoding="utf-8"?>
-<ds:datastoreItem xmlns:ds="http://schemas.openxmlformats.org/officeDocument/2006/customXml" ds:itemID="{AFA12D2E-770C-4F07-9498-9449D7F5706D}">
+<ds:datastoreItem xmlns:ds="http://schemas.openxmlformats.org/officeDocument/2006/customXml" ds:itemID="{5EBBEFFC-24F9-49DD-A71C-D19AC4E004AD}">
   <ds:schemaRefs>
     <ds:schemaRef ds:uri="http://schemas.openxmlformats.org/officeDocument/2006/bibliography"/>
   </ds:schemaRefs>

</xml_diff>

<commit_message>
Revisi 24 Juli 2026
</commit_message>
<xml_diff>
--- a/Dokumen Laporan Skripsi/TA Skripsi - 202210370311094 - M. Heykal Dhafariel Rajendra.docx
+++ b/Dokumen Laporan Skripsi/TA Skripsi - 202210370311094 - M. Heykal Dhafariel Rajendra.docx
@@ -14000,10 +14000,10 @@
           <w:noProof/>
         </w:rPr>
         <w:drawing>
-          <wp:inline distT="0" distB="0" distL="0" distR="0" wp14:anchorId="77711289" wp14:editId="5E15BEB2">
-            <wp:extent cx="2641600" cy="7257061"/>
-            <wp:effectExtent l="0" t="0" r="6350" b="1270"/>
-            <wp:docPr id="3" name="Picture 3" descr="D:\Downloads\Diagram Tanpa Judul.drawio (4).png"/>
+          <wp:inline distT="0" distB="0" distL="0" distR="0" wp14:anchorId="30866EE4" wp14:editId="4734B748">
+            <wp:extent cx="3168015" cy="3069590"/>
+            <wp:effectExtent l="0" t="0" r="0" b="0"/>
+            <wp:docPr id="10" name="Picture 10" descr="C:\Users\user\Downloads\Diagram Tanpa Judul.drawio (1).png"/>
             <wp:cNvGraphicFramePr>
               <a:graphicFrameLocks xmlns:a="http://schemas.openxmlformats.org/drawingml/2006/main" noChangeAspect="1"/>
             </wp:cNvGraphicFramePr>
@@ -14011,7 +14011,7 @@
               <a:graphicData uri="http://schemas.openxmlformats.org/drawingml/2006/picture">
                 <pic:pic xmlns:pic="http://schemas.openxmlformats.org/drawingml/2006/picture">
                   <pic:nvPicPr>
-                    <pic:cNvPr id="0" name="Picture 2" descr="D:\Downloads\Diagram Tanpa Judul.drawio (4).png"/>
+                    <pic:cNvPr id="0" name="Picture 2" descr="C:\Users\user\Downloads\Diagram Tanpa Judul.drawio (1).png"/>
                     <pic:cNvPicPr>
                       <a:picLocks noChangeAspect="1" noChangeArrowheads="1"/>
                     </pic:cNvPicPr>
@@ -14032,7 +14032,7 @@
                   <pic:spPr bwMode="auto">
                     <a:xfrm>
                       <a:off x="0" y="0"/>
-                      <a:ext cx="2689820" cy="7389531"/>
+                      <a:ext cx="3168015" cy="3069590"/>
                     </a:xfrm>
                     <a:prstGeom prst="rect">
                       <a:avLst/>
@@ -14052,6 +14052,7 @@
     <w:p>
       <w:pPr>
         <w:pStyle w:val="Caption"/>
+        <w:spacing w:line="360" w:lineRule="auto"/>
         <w:jc w:val="center"/>
         <w:rPr>
           <w:b/>
@@ -14134,16 +14135,6 @@
         <w:t xml:space="preserve"> Diagram Metodologi Penelitian</w:t>
       </w:r>
       <w:bookmarkEnd w:id="32"/>
-      <w:r>
-        <w:rPr>
-          <w:b/>
-          <w:i w:val="0"/>
-          <w:color w:val="auto"/>
-          <w:sz w:val="24"/>
-          <w:szCs w:val="24"/>
-        </w:rPr>
-        <w:br w:type="page"/>
-      </w:r>
     </w:p>
     <w:p>
       <w:pPr>
@@ -14157,7 +14148,6 @@
         <w:rPr>
           <w:lang w:val="en-US"/>
         </w:rPr>
-        <w:lastRenderedPageBreak/>
         <w:t>Diagram metodologi penelitian pada Gambar 3.1 menggambarkan alur penelitian yang disusun berdasarkan metode Personal Extreme Programming (PXP). Penelitian diawali dengan identifikasi masalah dan studi literatur, dilanjutkan dengan pengumpulan data melalui observasi dan wawancara untuk memperoleh kebutuhan sistem. Kebutuhan tersebut dianalisis dan dikembangkan menjadi model sistem menggunakan tahapan PXP yang meliputi requirements, planning, iteration, design, implementation, testing, dan retrospective. Implementasi dilakukan dalam bentuk prototype sistem, yang kemudian diuji menggunakan automated black box testing untuk memastikan fungsionalitas sistem. Selanjutnya dilakukan evaluasi dan perbaikan sebelum prototype diuji kepada pengguna melalui User Acceptance Test (UAT). Tahap akhir penelitian adalah analisis hasil pengujian serta penyusunan kesimpulan dan rekomendasi.</w:t>
       </w:r>
     </w:p>
@@ -14197,7 +14187,15 @@
           <w:rFonts w:eastAsia="Calibri"/>
           <w:lang w:val="en-US"/>
         </w:rPr>
-        <w:t>Penelitian ini dilaksanakan pada King Aluminium Malang, sebuah usaha yang bergerak di bidang konstruksi dan manufaktur aluminium. Lokasi usaha menjadi tempat utama pengambilan data terkait proses bisnis pengecekan stok dan pengadaan material yang menjadi fokus studi kasus.</w:t>
+        <w:t xml:space="preserve">Penelitian ini dilaksanakan pada King Aluminium Malang, sebuah usaha yang bergerak di bidang konstruksi dan manufaktur aluminium. Lokasi usaha </w:t>
+      </w:r>
+      <w:r>
+        <w:rPr>
+          <w:rFonts w:eastAsia="Calibri"/>
+          <w:lang w:val="en-US"/>
+        </w:rPr>
+        <w:lastRenderedPageBreak/>
+        <w:t>menjadi tempat utama pengambilan data terkait proses bisnis pengecekan stok dan pengadaan material yang menjadi fokus studi kasus.</w:t>
       </w:r>
     </w:p>
     <w:p>
@@ -14242,7 +14240,7 @@
     </w:p>
     <w:p>
       <w:pPr>
-        <w:spacing w:line="360" w:lineRule="auto"/>
+        <w:spacing w:after="240" w:line="360" w:lineRule="auto"/>
         <w:ind w:firstLine="720"/>
         <w:rPr>
           <w:lang w:val="en-US"/>
@@ -14254,20 +14252,8 @@
         </w:rPr>
         <w:t>Dalam menunjang kelancaran penelitian dan perancangan model sistem, penulis menggunakan perangkat keras (hardware) dan perangkat lunak (software) dengan spesifikasi sebagai berikut:</w:t>
       </w:r>
-    </w:p>
-    <w:p>
-      <w:pPr>
-        <w:spacing w:line="360" w:lineRule="auto"/>
-        <w:rPr>
-          <w:lang w:val="en-US"/>
-        </w:rPr>
-      </w:pPr>
-      <w:r>
-        <w:rPr>
-          <w:lang w:val="en-US"/>
-        </w:rPr>
-        <w:br w:type="page"/>
-      </w:r>
+      <w:bookmarkStart w:id="35" w:name="_GoBack"/>
+      <w:bookmarkEnd w:id="35"/>
     </w:p>
     <w:p>
       <w:pPr>
@@ -14282,15 +14268,14 @@
           <w:lang w:val="en-US"/>
         </w:rPr>
       </w:pPr>
-      <w:bookmarkStart w:id="35" w:name="_Toc234967008"/>
+      <w:bookmarkStart w:id="36" w:name="_Toc234967008"/>
       <w:r>
         <w:rPr>
           <w:lang w:val="en-US"/>
         </w:rPr>
-        <w:lastRenderedPageBreak/>
         <w:t>Perangkat Keras (Hardware)</w:t>
       </w:r>
-      <w:bookmarkEnd w:id="35"/>
+      <w:bookmarkEnd w:id="36"/>
     </w:p>
     <w:p>
       <w:pPr>
@@ -14400,14 +14385,14 @@
           <w:lang w:val="en-US"/>
         </w:rPr>
       </w:pPr>
-      <w:bookmarkStart w:id="36" w:name="_Toc234967009"/>
+      <w:bookmarkStart w:id="37" w:name="_Toc234967009"/>
       <w:r>
         <w:rPr>
           <w:lang w:val="en-US"/>
         </w:rPr>
         <w:t>Perangkat Lunak (Software)</w:t>
       </w:r>
-      <w:bookmarkEnd w:id="36"/>
+      <w:bookmarkEnd w:id="37"/>
     </w:p>
     <w:p>
       <w:pPr>
@@ -14515,14 +14500,15 @@
           <w:lang w:val="en-US"/>
         </w:rPr>
       </w:pPr>
-      <w:bookmarkStart w:id="37" w:name="_Toc234967010"/>
+      <w:bookmarkStart w:id="38" w:name="_Toc234967010"/>
       <w:r>
         <w:rPr>
           <w:lang w:val="en-US"/>
         </w:rPr>
+        <w:lastRenderedPageBreak/>
         <w:t>Metode Pengumpulan Data</w:t>
       </w:r>
-      <w:bookmarkEnd w:id="37"/>
+      <w:bookmarkEnd w:id="38"/>
     </w:p>
     <w:p>
       <w:pPr>
@@ -14608,14 +14594,7 @@
         <w:rPr>
           <w:lang w:val="en-US"/>
         </w:rPr>
-        <w:t xml:space="preserve">Wawancara dilakukan secara semi-terstruktur dengan pemilik usaha dan staf administrasi gudang. Pertanyaan difokuskan pada kendala yang sering terjadi </w:t>
-      </w:r>
-      <w:r>
-        <w:rPr>
-          <w:lang w:val="en-US"/>
-        </w:rPr>
-        <w:lastRenderedPageBreak/>
-        <w:t>(seperti selisih stok atau keterlambatan material), serta menggali kebutuhan fungsional yang diharapkan pengguna dalam rancangan sistem baru.</w:t>
+        <w:t>Wawancara dilakukan secara semi-terstruktur dengan pemilik usaha dan staf administrasi gudang. Pertanyaan difokuskan pada kendala yang sering terjadi (seperti selisih stok atau keterlambatan material), serta menggali kebutuhan fungsional yang diharapkan pengguna dalam rancangan sistem baru.</w:t>
       </w:r>
     </w:p>
     <w:p>
@@ -14656,6 +14635,21 @@
     </w:p>
     <w:p>
       <w:pPr>
+        <w:spacing w:after="160"/>
+        <w:jc w:val="left"/>
+        <w:rPr>
+          <w:lang w:val="en-US"/>
+        </w:rPr>
+      </w:pPr>
+      <w:r>
+        <w:rPr>
+          <w:lang w:val="en-US"/>
+        </w:rPr>
+        <w:br w:type="page"/>
+      </w:r>
+    </w:p>
+    <w:p>
+      <w:pPr>
         <w:pStyle w:val="Heading2"/>
         <w:numPr>
           <w:ilvl w:val="0"/>
@@ -14666,14 +14660,15 @@
           <w:lang w:val="en-US"/>
         </w:rPr>
       </w:pPr>
-      <w:bookmarkStart w:id="38" w:name="_Toc234967011"/>
+      <w:bookmarkStart w:id="39" w:name="_Toc234967011"/>
       <w:r>
         <w:rPr>
           <w:lang w:val="en-US"/>
         </w:rPr>
+        <w:lastRenderedPageBreak/>
         <w:t>Metode Pengembangan Sistem</w:t>
       </w:r>
-      <w:bookmarkEnd w:id="38"/>
+      <w:bookmarkEnd w:id="39"/>
     </w:p>
     <w:p>
       <w:pPr>
@@ -14751,6 +14746,7 @@
     <w:p>
       <w:pPr>
         <w:pStyle w:val="Caption"/>
+        <w:spacing w:line="360" w:lineRule="auto"/>
         <w:jc w:val="center"/>
         <w:rPr>
           <w:b/>
@@ -14760,7 +14756,7 @@
           <w:szCs w:val="24"/>
         </w:rPr>
       </w:pPr>
-      <w:bookmarkStart w:id="39" w:name="_Toc233127916"/>
+      <w:bookmarkStart w:id="40" w:name="_Toc233127916"/>
       <w:r>
         <w:rPr>
           <w:b/>
@@ -14832,13 +14828,7 @@
         </w:rPr>
         <w:t xml:space="preserve"> Diagram PXP</w:t>
       </w:r>
-      <w:bookmarkEnd w:id="39"/>
-    </w:p>
-    <w:p>
-      <w:pPr>
-        <w:spacing w:line="360" w:lineRule="auto"/>
-        <w:jc w:val="center"/>
-      </w:pPr>
+      <w:bookmarkEnd w:id="40"/>
     </w:p>
     <w:p>
       <w:pPr>
@@ -14846,7 +14836,6 @@
         <w:ind w:firstLine="720"/>
       </w:pPr>
       <w:r>
-        <w:lastRenderedPageBreak/>
         <w:t>Metode pengembangan sistem yang digunakan dalam penelitian ini adalah Personal Extreme Programming (PXP). Metode ini dipilih karena pengembangan dilakukan oleh satu orang (solo developer) dan membutuhkan fleksibilitas tinggi dalam menyesuaikan kebutuhan pengguna. Mengingat batasan penelitian yang difokuskan pada perancangan model sistem dan evaluasi desain, tahapan PXP dalam penelitian ini diadaptasi agar sesuai dengan ruang lingkup tersebut. Setiap tahapan PXP dijelaskan secara rinci untuk menunjukkan aktivitas teknis yang dilakukan oleh peneliti.</w:t>
       </w:r>
     </w:p>
@@ -14856,6 +14845,7 @@
         <w:ind w:firstLine="720"/>
       </w:pPr>
       <w:r>
+        <w:lastRenderedPageBreak/>
         <w:t>Metode pengembangan sistem dalam penelitian ini dibatasi pada implementasi model sistem dalam bentuk prototype interaktif. Ruang lingkup pengembangan hanya mencakup fitur inti yang berhubungan langsung dengan proses pengecekan stok dan pengadaan material aluminium. Pengembangan tidak mencakup integrasi basis data produksi skala penuh, sistem keamanan lanjutan, maupun pengujian performa teknis. Pembatasan ini dilakukan agar proses pengembangan tetap terfokus pada validasi model sistem sesuai kebutuhan operasional pengguna.</w:t>
       </w:r>
     </w:p>
@@ -14869,11 +14859,11 @@
         <w:spacing w:line="360" w:lineRule="auto"/>
         <w:ind w:left="426"/>
       </w:pPr>
-      <w:bookmarkStart w:id="40" w:name="_Toc234967012"/>
+      <w:bookmarkStart w:id="41" w:name="_Toc234967012"/>
       <w:r>
         <w:t>Requirements</w:t>
       </w:r>
-      <w:bookmarkEnd w:id="40"/>
+      <w:bookmarkEnd w:id="41"/>
     </w:p>
     <w:p>
       <w:pPr>
@@ -15021,7 +15011,6 @@
         <w:ind w:left="851"/>
       </w:pPr>
       <w:r>
-        <w:lastRenderedPageBreak/>
         <w:t>Topik yang dibahas meliputi:</w:t>
       </w:r>
     </w:p>
@@ -15118,6 +15107,7 @@
         <w:ind w:left="851"/>
       </w:pPr>
       <w:r>
+        <w:lastRenderedPageBreak/>
         <w:t>Hasil observasi dan wawancara kemudian dirangkum menjadi User Stories, yang merepresentasikan kebutuhan pengguna dalam bentuk fungsional.</w:t>
       </w:r>
     </w:p>
@@ -15205,11 +15195,11 @@
         <w:spacing w:line="360" w:lineRule="auto"/>
         <w:ind w:left="426"/>
       </w:pPr>
-      <w:bookmarkStart w:id="41" w:name="_Toc234967013"/>
+      <w:bookmarkStart w:id="42" w:name="_Toc234967013"/>
       <w:r>
         <w:t>Planning</w:t>
       </w:r>
-      <w:bookmarkEnd w:id="41"/>
+      <w:bookmarkEnd w:id="42"/>
     </w:p>
     <w:p>
       <w:pPr>
@@ -15337,7 +15327,6 @@
         <w:ind w:left="851"/>
       </w:pPr>
       <w:r>
-        <w:lastRenderedPageBreak/>
         <w:t>Setiap User Story diterjemahkan ke dalam skenario penggunaan (use scenario) yang menggambarkan bagaimana pengguna berinteraksi dengan sistem dari awal hingga akhir.</w:t>
       </w:r>
     </w:p>
@@ -15359,11 +15348,12 @@
         <w:spacing w:line="360" w:lineRule="auto"/>
         <w:ind w:left="426"/>
       </w:pPr>
-      <w:bookmarkStart w:id="42" w:name="_Toc234967014"/>
-      <w:r>
+      <w:bookmarkStart w:id="43" w:name="_Toc234967014"/>
+      <w:r>
+        <w:lastRenderedPageBreak/>
         <w:t>Iteration Initialization</w:t>
       </w:r>
-      <w:bookmarkEnd w:id="42"/>
+      <w:bookmarkEnd w:id="43"/>
     </w:p>
     <w:p>
       <w:pPr>
@@ -15596,11 +15586,11 @@
         <w:spacing w:line="360" w:lineRule="auto"/>
         <w:ind w:left="426"/>
       </w:pPr>
-      <w:bookmarkStart w:id="43" w:name="_Toc234967015"/>
+      <w:bookmarkStart w:id="44" w:name="_Toc234967015"/>
       <w:r>
         <w:t>Design</w:t>
       </w:r>
-      <w:bookmarkEnd w:id="43"/>
+      <w:bookmarkEnd w:id="44"/>
     </w:p>
     <w:p>
       <w:pPr>
@@ -15629,7 +15619,6 @@
         <w:ind w:left="426"/>
       </w:pPr>
       <w:r>
-        <w:lastRenderedPageBreak/>
         <w:t>Perancangan diagram sistem</w:t>
       </w:r>
     </w:p>
@@ -15700,6 +15689,7 @@
         <w:ind w:left="851"/>
       </w:pPr>
       <w:r>
+        <w:lastRenderedPageBreak/>
         <w:t>Wireframe digunakan untuk menentukan tata letak awal elemen antarmuka.</w:t>
       </w:r>
     </w:p>
@@ -15755,11 +15745,11 @@
         <w:spacing w:line="360" w:lineRule="auto"/>
         <w:ind w:left="426"/>
       </w:pPr>
-      <w:bookmarkStart w:id="44" w:name="_Toc234967016"/>
+      <w:bookmarkStart w:id="45" w:name="_Toc234967016"/>
       <w:r>
         <w:t>Implementation</w:t>
       </w:r>
-      <w:bookmarkEnd w:id="44"/>
+      <w:bookmarkEnd w:id="45"/>
     </w:p>
     <w:p>
       <w:pPr>
@@ -15830,11 +15820,11 @@
         <w:spacing w:line="360" w:lineRule="auto"/>
         <w:ind w:left="426"/>
       </w:pPr>
-      <w:bookmarkStart w:id="45" w:name="_Toc234967017"/>
+      <w:bookmarkStart w:id="46" w:name="_Toc234967017"/>
       <w:r>
         <w:t>System Testing</w:t>
       </w:r>
-      <w:bookmarkEnd w:id="45"/>
+      <w:bookmarkEnd w:id="46"/>
     </w:p>
     <w:p>
       <w:pPr>
@@ -15870,16 +15860,9 @@
     </w:p>
     <w:p>
       <w:pPr>
-        <w:spacing w:after="240" w:line="360" w:lineRule="auto"/>
-        <w:ind w:firstLine="720"/>
-      </w:pPr>
-    </w:p>
-    <w:p>
-      <w:pPr>
-        <w:spacing w:line="360" w:lineRule="auto"/>
-      </w:pPr>
-      <w:r>
-        <w:lastRenderedPageBreak/>
+        <w:spacing w:line="360" w:lineRule="auto"/>
+      </w:pPr>
+      <w:r>
         <w:t>Alat (Tool) yang Digunakan:</w:t>
       </w:r>
     </w:p>
@@ -15928,6 +15911,7 @@
         <w:ind w:left="426"/>
       </w:pPr>
       <w:r>
+        <w:lastRenderedPageBreak/>
         <w:t>Skenario pengujian dibuat dalam bentuk rangkaian interaksi berurutan yang dijalankan secara konsisten untuk menguji alur sistem.</w:t>
       </w:r>
     </w:p>
@@ -16162,12 +16146,11 @@
         <w:spacing w:line="360" w:lineRule="auto"/>
         <w:ind w:left="426"/>
       </w:pPr>
-      <w:bookmarkStart w:id="46" w:name="_Toc234967018"/>
-      <w:r>
-        <w:lastRenderedPageBreak/>
+      <w:bookmarkStart w:id="47" w:name="_Toc234967018"/>
+      <w:r>
         <w:t>Retrospective</w:t>
       </w:r>
-      <w:bookmarkEnd w:id="46"/>
+      <w:bookmarkEnd w:id="47"/>
     </w:p>
     <w:p>
       <w:pPr>
@@ -16175,7 +16158,11 @@
         <w:ind w:firstLine="720"/>
       </w:pPr>
       <w:r>
-        <w:t>Pada tahap Retrospective, peneliti melakukan evaluasi terhadap hasil prototipe yang telah melalui proses perancangan dan pengujian fungsional. Evaluasi dilakukan secara mandiri oleh peneliti dengan membandingkan hasil prototipe terhadap User Stories dan skenario penggunaan sistem yang telah ditetapkan pada tahap Requirements dan Planning.</w:t>
+        <w:t xml:space="preserve">Pada tahap Retrospective, peneliti melakukan evaluasi terhadap hasil prototipe yang telah melalui proses perancangan dan pengujian fungsional. Evaluasi dilakukan secara mandiri oleh peneliti dengan membandingkan hasil </w:t>
+      </w:r>
+      <w:r>
+        <w:lastRenderedPageBreak/>
+        <w:t>prototipe terhadap User Stories dan skenario penggunaan sistem yang telah ditetapkan pada tahap Requirements dan Planning.</w:t>
       </w:r>
     </w:p>
     <w:p>
@@ -16330,11 +16317,11 @@
         </w:numPr>
         <w:spacing w:line="360" w:lineRule="auto"/>
       </w:pPr>
-      <w:bookmarkStart w:id="47" w:name="_Toc234967019"/>
+      <w:bookmarkStart w:id="48" w:name="_Toc234967019"/>
       <w:r>
         <w:t>Metode Pengujian User Acceptance Test (UAT)</w:t>
       </w:r>
-      <w:bookmarkEnd w:id="47"/>
+      <w:bookmarkEnd w:id="48"/>
     </w:p>
     <w:p>
       <w:pPr>
@@ -16355,20 +16342,23 @@
         <w:spacing w:line="360" w:lineRule="auto"/>
         <w:ind w:left="426"/>
       </w:pPr>
-      <w:bookmarkStart w:id="48" w:name="_Toc234967020"/>
+      <w:bookmarkStart w:id="49" w:name="_Toc234967020"/>
+      <w:r>
+        <w:t>Responden Penelitian</w:t>
+      </w:r>
+      <w:bookmarkEnd w:id="49"/>
+    </w:p>
+    <w:p>
+      <w:pPr>
+        <w:spacing w:line="360" w:lineRule="auto"/>
+        <w:ind w:firstLine="720"/>
+      </w:pPr>
+      <w:r>
+        <w:t xml:space="preserve">Responden dalam pengujian ini adalah pihak-pihak yang terlibat langsung dalam penggunaan sistem, yaitu Pemilik Usaha dan Staf Gudang/Administrasi King Aluminium Malang. Teknik pengambilan sampel menggunakan sampling jenuh </w:t>
+      </w:r>
       <w:r>
         <w:lastRenderedPageBreak/>
-        <w:t>Responden Penelitian</w:t>
-      </w:r>
-      <w:bookmarkEnd w:id="48"/>
-    </w:p>
-    <w:p>
-      <w:pPr>
-        <w:spacing w:line="360" w:lineRule="auto"/>
-        <w:ind w:firstLine="720"/>
-      </w:pPr>
-      <w:r>
-        <w:t>Responden dalam pengujian ini adalah pihak-pihak yang terlibat langsung dalam penggunaan sistem, yaitu Pemilik Usaha dan Staf Gudang/Administrasi King Aluminium Malang. Teknik pengambilan sampel menggunakan sampling jenuh (sensus), di mana seluruh pengguna potensial sistem dijadikan responden agar hasil evaluasi mencerminkan kebutuhan nyata di lapangan.</w:t>
+        <w:t>(sensus), di mana seluruh pengguna potensial sistem dijadikan responden agar hasil evaluasi mencerminkan kebutuhan nyata di lapangan.</w:t>
       </w:r>
     </w:p>
     <w:p>
@@ -16408,11 +16398,11 @@
         <w:spacing w:line="360" w:lineRule="auto"/>
         <w:ind w:left="426"/>
       </w:pPr>
-      <w:bookmarkStart w:id="49" w:name="_Toc234967021"/>
+      <w:bookmarkStart w:id="50" w:name="_Toc234967021"/>
       <w:r>
         <w:t>Instrumen Pengujian</w:t>
       </w:r>
-      <w:bookmarkEnd w:id="49"/>
+      <w:bookmarkEnd w:id="50"/>
     </w:p>
     <w:p>
       <w:pPr>
@@ -16429,8 +16419,11 @@
         <w:ind w:firstLine="720"/>
       </w:pPr>
       <w:r>
+        <w:t xml:space="preserve">Pada tahap usability testing, prototype yang telah dibuat menggunakan Figma diintegrasikan dengan aplikasi Maze. Melalui aplikasi tersebut, responden diminta menyelesaikan beberapa skenario tugas (task scenario) sesuai dengan proses bisnis sistem pengecekan stok dan pengadaan material. Selama proses pengujian, Maze secara otomatis mencatat aktivitas pengguna, seperti tingkat </w:t>
+      </w:r>
+      <w:r>
         <w:lastRenderedPageBreak/>
-        <w:t>Pada tahap usability testing, prototype yang telah dibuat menggunakan Figma diintegrasikan dengan aplikasi Maze. Melalui aplikasi tersebut, responden diminta menyelesaikan beberapa skenario tugas (task scenario) sesuai dengan proses bisnis sistem pengecekan stok dan pengadaan material. Selama proses pengujian, Maze secara otomatis mencatat aktivitas pengguna, seperti tingkat keberhasilan penyelesaian tugas (task success rate), waktu penyelesaian (task completion time), jumlah kesalahan (misclick), serta jalur navigasi yang ditempuh pengguna.</w:t>
+        <w:t>keberhasilan penyelesaian tugas (task success rate), waktu penyelesaian (task completion time), jumlah kesalahan (misclick), serta jalur navigasi yang ditempuh pengguna.</w:t>
       </w:r>
     </w:p>
     <w:p>
@@ -16594,7 +16587,6 @@
         <w:spacing w:after="240" w:line="360" w:lineRule="auto"/>
       </w:pPr>
       <w:r>
-        <w:lastRenderedPageBreak/>
         <w:t>Hasil usability testing dan hasil kuesioner dianalisis sebagai dasar evaluasi prototype.</w:t>
       </w:r>
     </w:p>
@@ -16608,11 +16600,11 @@
         <w:spacing w:line="360" w:lineRule="auto"/>
         <w:ind w:left="426"/>
       </w:pPr>
-      <w:bookmarkStart w:id="50" w:name="_Toc234967022"/>
+      <w:bookmarkStart w:id="51" w:name="_Toc234967022"/>
       <w:r>
         <w:t>Skenario Usability Testing</w:t>
       </w:r>
-      <w:bookmarkEnd w:id="50"/>
+      <w:bookmarkEnd w:id="51"/>
     </w:p>
     <w:p>
       <w:pPr>
@@ -16620,7 +16612,11 @@
         <w:ind w:firstLine="720"/>
       </w:pPr>
       <w:r>
-        <w:t>Sebelum responden mengisi kuesioner, dilakukan usability testing menggunakan aplikasi Maze. Pengujian dilakukan dengan memberikan beberapa skenario tugas yang mewakili fungsi utama pada prototype sistem. Setiap responden diminta menyelesaikan seluruh tugas secara mandiri tanpa diberikan petunjuk mengenai alur navigasi. Pendekatan ini bertujuan untuk mengetahui tingkat kemudahan penggunaan prototype berdasarkan interaksi nyata pengguna.</w:t>
+        <w:t xml:space="preserve">Sebelum responden mengisi kuesioner, dilakukan usability testing menggunakan aplikasi Maze. Pengujian dilakukan dengan memberikan beberapa </w:t>
+      </w:r>
+      <w:r>
+        <w:lastRenderedPageBreak/>
+        <w:t>skenario tugas yang mewakili fungsi utama pada prototype sistem. Setiap responden diminta menyelesaikan seluruh tugas secara mandiri tanpa diberikan petunjuk mengenai alur navigasi. Pendekatan ini bertujuan untuk mengetahui tingkat kemudahan penggunaan prototype berdasarkan interaksi nyata pengguna.</w:t>
       </w:r>
     </w:p>
     <w:p>
@@ -16636,7 +16632,7 @@
           <w:szCs w:val="24"/>
         </w:rPr>
       </w:pPr>
-      <w:bookmarkStart w:id="51" w:name="_Toc234966709"/>
+      <w:bookmarkStart w:id="52" w:name="_Toc234966709"/>
       <w:r>
         <w:rPr>
           <w:b/>
@@ -16708,7 +16704,7 @@
         </w:rPr>
         <w:t xml:space="preserve"> Skenario Usability Testing</w:t>
       </w:r>
-      <w:bookmarkEnd w:id="51"/>
+      <w:bookmarkEnd w:id="52"/>
     </w:p>
     <w:tbl>
       <w:tblPr>
@@ -17125,15 +17121,14 @@
         <w:spacing w:line="360" w:lineRule="auto"/>
         <w:ind w:left="426"/>
       </w:pPr>
-      <w:bookmarkStart w:id="52" w:name="_Toc234967023"/>
-      <w:r>
-        <w:lastRenderedPageBreak/>
+      <w:bookmarkStart w:id="53" w:name="_Toc234967023"/>
+      <w:r>
         <w:t>Teknik Analisis Dat</w:t>
       </w:r>
       <w:r>
         <w:t>a</w:t>
       </w:r>
-      <w:bookmarkEnd w:id="52"/>
+      <w:bookmarkEnd w:id="53"/>
     </w:p>
     <w:p>
       <w:pPr>
@@ -17144,215 +17139,16 @@
         <w:t>Data hasil kuesioner diolah menggunakan analisis deskriptif kuantitatif untuk memperoleh persentase kelayakan model sistem. Perhitungan dilakukan menggunakan rumus sebagai berikut:</w:t>
       </w:r>
     </w:p>
-    <w:tbl>
-      <w:tblPr>
-        <w:tblStyle w:val="TableGrid"/>
-        <w:tblW w:w="0" w:type="auto"/>
-        <w:tblBorders>
-          <w:top w:val="none" w:sz="0" w:space="0" w:color="auto"/>
-          <w:left w:val="none" w:sz="0" w:space="0" w:color="auto"/>
-          <w:bottom w:val="none" w:sz="0" w:space="0" w:color="auto"/>
-          <w:right w:val="none" w:sz="0" w:space="0" w:color="auto"/>
-          <w:insideH w:val="none" w:sz="0" w:space="0" w:color="auto"/>
-          <w:insideV w:val="none" w:sz="0" w:space="0" w:color="auto"/>
-        </w:tblBorders>
-        <w:tblCellMar>
-          <w:left w:w="0" w:type="dxa"/>
-          <w:right w:w="0" w:type="dxa"/>
-        </w:tblCellMar>
-        <w:tblLook w:val="04A0" w:firstRow="1" w:lastRow="0" w:firstColumn="1" w:lastColumn="0" w:noHBand="0" w:noVBand="1"/>
-      </w:tblPr>
-      <w:tblGrid>
-        <w:gridCol w:w="5807"/>
-        <w:gridCol w:w="2120"/>
-      </w:tblGrid>
-      <w:tr>
-        <w:tc>
-          <w:tcPr>
-            <w:tcW w:w="5807" w:type="dxa"/>
-          </w:tcPr>
-          <w:p>
-            <w:pPr>
-              <w:spacing w:after="240" w:line="360" w:lineRule="auto"/>
-            </w:pPr>
-            <m:oMathPara>
-              <m:oMath>
-                <m:r>
-                  <w:rPr>
-                    <w:rStyle w:val="Strong"/>
-                    <w:rFonts w:ascii="Cambria Math" w:hAnsi="Cambria Math" w:cs="Cambria Math"/>
-                  </w:rPr>
-                  <m:t>Persentase</m:t>
-                </m:r>
-                <m:r>
-                  <m:rPr>
-                    <m:sty m:val="p"/>
-                  </m:rPr>
-                  <w:rPr>
-                    <w:rStyle w:val="Strong"/>
-                    <w:rFonts w:ascii="Cambria Math" w:hAnsi="Cambria Math" w:cs="Cambria Math"/>
-                  </w:rPr>
-                  <m:t>=</m:t>
-                </m:r>
-                <m:f>
-                  <m:fPr>
-                    <m:ctrlPr>
-                      <w:rPr>
-                        <w:rStyle w:val="Strong"/>
-                        <w:rFonts w:ascii="Cambria Math" w:hAnsi="Cambria Math" w:cs="Times New Roman"/>
-                        <w:b w:val="0"/>
-                        <w:bCs w:val="0"/>
-                      </w:rPr>
-                    </m:ctrlPr>
-                  </m:fPr>
-                  <m:num>
-                    <m:r>
-                      <m:rPr>
-                        <m:sty m:val="p"/>
-                      </m:rPr>
-                      <w:rPr>
-                        <w:rStyle w:val="Strong"/>
-                        <w:rFonts w:ascii="Cambria Math" w:hAnsi="Cambria Math" w:cs="Cambria Math"/>
-                      </w:rPr>
-                      <m:t>Total Skor Aktual</m:t>
-                    </m:r>
-                  </m:num>
-                  <m:den>
-                    <m:r>
-                      <m:rPr>
-                        <m:sty m:val="p"/>
-                      </m:rPr>
-                      <w:rPr>
-                        <w:rStyle w:val="Strong"/>
-                        <w:rFonts w:ascii="Cambria Math" w:hAnsi="Cambria Math" w:cs="Cambria Math"/>
-                      </w:rPr>
-                      <m:t>Total Skor Ideal</m:t>
-                    </m:r>
-                  </m:den>
-                </m:f>
-                <m:r>
-                  <w:rPr>
-                    <w:rStyle w:val="Strong"/>
-                    <w:rFonts w:ascii="Cambria Math" w:hAnsi="Cambria Math" w:cs="Times New Roman"/>
-                  </w:rPr>
-                  <m:t xml:space="preserve"> ×100%</m:t>
-                </m:r>
-              </m:oMath>
-            </m:oMathPara>
-          </w:p>
-        </w:tc>
-        <w:tc>
-          <w:tcPr>
-            <w:tcW w:w="2120" w:type="dxa"/>
-            <w:vAlign w:val="center"/>
-          </w:tcPr>
-          <w:p>
-            <w:pPr>
-              <w:keepNext/>
-              <w:spacing w:after="240" w:line="360" w:lineRule="auto"/>
-              <w:jc w:val="left"/>
-              <w:rPr>
-                <w:b/>
-                <w:iCs/>
-              </w:rPr>
-            </w:pPr>
-            <w:bookmarkStart w:id="53" w:name="_Toc234966827"/>
-            <w:r>
-              <w:rPr>
-                <w:b/>
-                <w:iCs/>
-              </w:rPr>
-              <w:t>(</w:t>
-            </w:r>
-            <w:r>
-              <w:rPr>
-                <w:b/>
-                <w:iCs/>
-              </w:rPr>
-              <w:fldChar w:fldCharType="begin"/>
-            </w:r>
-            <w:r>
-              <w:rPr>
-                <w:b/>
-                <w:iCs/>
-              </w:rPr>
-              <w:instrText xml:space="preserve"> SEQ Rumus \* ARABIC </w:instrText>
-            </w:r>
-            <w:r>
-              <w:rPr>
-                <w:b/>
-                <w:iCs/>
-              </w:rPr>
-              <w:fldChar w:fldCharType="separate"/>
-            </w:r>
-            <w:r>
-              <w:rPr>
-                <w:b/>
-                <w:iCs/>
-                <w:noProof/>
-              </w:rPr>
-              <w:t>2</w:t>
-            </w:r>
-            <w:r>
-              <w:rPr>
-                <w:b/>
-              </w:rPr>
-              <w:fldChar w:fldCharType="end"/>
-            </w:r>
-            <w:r>
-              <w:rPr>
-                <w:b/>
-              </w:rPr>
-              <w:t>)</w:t>
-            </w:r>
-            <w:bookmarkEnd w:id="53"/>
-          </w:p>
-        </w:tc>
-      </w:tr>
-    </w:tbl>
-    <w:p>
-      <w:pPr>
-        <w:spacing w:line="360" w:lineRule="auto"/>
-      </w:pPr>
-      <w:r>
-        <w:t>Keterangan:</w:t>
-      </w:r>
-    </w:p>
-    <w:p>
-      <w:pPr>
-        <w:pStyle w:val="ListParagraph"/>
-        <w:numPr>
-          <w:ilvl w:val="0"/>
-          <w:numId w:val="56"/>
-        </w:numPr>
-        <w:spacing w:after="240" w:line="360" w:lineRule="auto"/>
-      </w:pPr>
-      <w:r>
-        <w:t>Total Skor Aktual = Jumlah jawaban responden.</w:t>
-      </w:r>
-    </w:p>
-    <w:p>
-      <w:pPr>
-        <w:pStyle w:val="ListParagraph"/>
-        <w:numPr>
-          <w:ilvl w:val="0"/>
-          <w:numId w:val="56"/>
-        </w:numPr>
-        <w:spacing w:after="240" w:line="360" w:lineRule="auto"/>
-      </w:pPr>
-      <w:r>
-        <w:t>Total Skor Ideal = Skor maksimal x Jumlah responden.</w:t>
-      </w:r>
-    </w:p>
-    <w:p>
-      <w:pPr>
-        <w:spacing w:line="360" w:lineRule="auto"/>
-      </w:pPr>
-      <w:r>
+    <w:p>
+      <w:pPr>
+        <w:spacing w:line="360" w:lineRule="auto"/>
+      </w:pPr>
+      <w:r>
+        <w:lastRenderedPageBreak/>
         <w:t>Rumus (</w:t>
       </w:r>
       <w:r>
-        <w:t>2</w:t>
+        <w:t>1</w:t>
       </w:r>
       <w:r>
         <w:t>) digunakan untuk menghitung persentase kelayakan sistem berdasarkan hasil User Acceptance Test (UAT) yang diperoleh melalui kuesioner skala Likert. Perhitungan dilakukan dengan membandingkan Total Skor Aktual, yaitu akumulasi seluruh skor jawaban responden terhadap pernyataan yang diberikan, dengan Total Skor Ideal, yaitu skor maksimum yang diperoleh dari perkalian skor tertinggi skala Likert dengan jumlah responden. Hasil perbandingan tersebut kemudian dikalikan 100% untuk memperoleh nilai persentase, yang menunjukkan tingkat penerimaan pengguna terhadap sistem, di mana semakin tinggi persentase yang dihasilkan maka semakin baik tingkat kelayakan dan penerimaan sistem oleh pengguna.</w:t>
@@ -17377,6 +17173,78 @@
         <w:t>BAB IV HASIL DAN PEMBAHASAN</w:t>
       </w:r>
       <w:bookmarkEnd w:id="54"/>
+    </w:p>
+    <w:p>
+      <w:pPr>
+        <w:spacing w:after="240" w:line="360" w:lineRule="auto"/>
+        <w:jc w:val="center"/>
+        <w:rPr>
+          <w:lang w:val="en-US"/>
+        </w:rPr>
+      </w:pPr>
+      <w:r>
+        <w:rPr>
+          <w:noProof/>
+          <w:lang w:val="en-US"/>
+        </w:rPr>
+        <w:drawing>
+          <wp:inline distT="0" distB="0" distL="0" distR="0" wp14:anchorId="308BC7F8" wp14:editId="0CE90DDE">
+            <wp:extent cx="3069590" cy="6390005"/>
+            <wp:effectExtent l="0" t="0" r="0" b="0"/>
+            <wp:docPr id="7" name="Picture 7" descr="C:\Users\user\Downloads\Diagram Tanpa Judul.drawio.png"/>
+            <wp:cNvGraphicFramePr>
+              <a:graphicFrameLocks xmlns:a="http://schemas.openxmlformats.org/drawingml/2006/main" noChangeAspect="1"/>
+            </wp:cNvGraphicFramePr>
+            <a:graphic xmlns:a="http://schemas.openxmlformats.org/drawingml/2006/main">
+              <a:graphicData uri="http://schemas.openxmlformats.org/drawingml/2006/picture">
+                <pic:pic xmlns:pic="http://schemas.openxmlformats.org/drawingml/2006/picture">
+                  <pic:nvPicPr>
+                    <pic:cNvPr id="0" name="Picture 1" descr="C:\Users\user\Downloads\Diagram Tanpa Judul.drawio.png"/>
+                    <pic:cNvPicPr>
+                      <a:picLocks noChangeAspect="1" noChangeArrowheads="1"/>
+                    </pic:cNvPicPr>
+                  </pic:nvPicPr>
+                  <pic:blipFill>
+                    <a:blip r:embed="rId20">
+                      <a:extLst>
+                        <a:ext uri="{28A0092B-C50C-407E-A947-70E740481C1C}">
+                          <a14:useLocalDpi xmlns:a14="http://schemas.microsoft.com/office/drawing/2010/main" val="0"/>
+                        </a:ext>
+                      </a:extLst>
+                    </a:blip>
+                    <a:srcRect/>
+                    <a:stretch>
+                      <a:fillRect/>
+                    </a:stretch>
+                  </pic:blipFill>
+                  <pic:spPr bwMode="auto">
+                    <a:xfrm>
+                      <a:off x="0" y="0"/>
+                      <a:ext cx="3069590" cy="6390005"/>
+                    </a:xfrm>
+                    <a:prstGeom prst="rect">
+                      <a:avLst/>
+                    </a:prstGeom>
+                    <a:noFill/>
+                    <a:ln>
+                      <a:noFill/>
+                    </a:ln>
+                  </pic:spPr>
+                </pic:pic>
+              </a:graphicData>
+            </a:graphic>
+          </wp:inline>
+        </w:drawing>
+      </w:r>
+    </w:p>
+    <w:p>
+      <w:pPr>
+        <w:spacing w:after="240" w:line="360" w:lineRule="auto"/>
+        <w:jc w:val="center"/>
+        <w:rPr>
+          <w:lang w:val="en-US"/>
+        </w:rPr>
+      </w:pPr>
     </w:p>
     <w:p>
       <w:pPr>
@@ -17390,6 +17258,7 @@
       </w:pPr>
       <w:bookmarkStart w:id="55" w:name="_Toc234967025"/>
       <w:r>
+        <w:lastRenderedPageBreak/>
         <w:t>Identifikasi Masalah</w:t>
       </w:r>
       <w:bookmarkEnd w:id="55"/>
@@ -17495,7 +17364,6 @@
         <w:ind w:left="426"/>
       </w:pPr>
       <w:r>
-        <w:lastRenderedPageBreak/>
         <w:t>Terjadi potensi miskomunikasi antar bagian dalam pengelolaan material.</w:t>
       </w:r>
     </w:p>
@@ -17519,6 +17387,7 @@
         <w:ind w:firstLine="720"/>
       </w:pPr>
       <w:r>
+        <w:lastRenderedPageBreak/>
         <w:t>Permasalahan-permasalahan tersebut menjadi dasar dalam perancangan model sistem yang diharapkan mampu meningkatkan efisiensi operasional serta mengurangi kesalahan dalam pengelolaan material di King Aluminium Malang.</w:t>
       </w:r>
     </w:p>
@@ -17578,7 +17447,7 @@
     <w:p>
       <w:pPr>
         <w:spacing w:line="360" w:lineRule="auto"/>
-        <w:ind w:left="142" w:firstLine="578"/>
+        <w:ind w:firstLine="720"/>
       </w:pPr>
       <w:r>
         <w:t>Dalam proses pengumpulan data, penelitian ini melibatkan beberapa pihak yang memiliki keterkaitan</w:t>
@@ -17586,21 +17455,9 @@
       <w:r>
         <w:t xml:space="preserve"> langsung dengan proses pengecekan stok dan pengadaan material. Pihak-pihak tersebut disebut sebagai stakeholder karena memiliki peran dalam alur operasional yang diteliti.</w:t>
       </w:r>
-    </w:p>
-    <w:p>
-      <w:pPr>
-        <w:spacing w:line="360" w:lineRule="auto"/>
-      </w:pPr>
-    </w:p>
-    <w:p>
-      <w:pPr>
-        <w:spacing w:line="360" w:lineRule="auto"/>
-      </w:pPr>
-    </w:p>
-    <w:p>
-      <w:pPr>
-        <w:spacing w:after="240" w:line="360" w:lineRule="auto"/>
-      </w:pPr>
+      <w:r>
+        <w:t xml:space="preserve"> </w:t>
+      </w:r>
       <w:r>
         <w:t>Adapun stakeholder yang terlibat adalah sebagai berikut:</w:t>
       </w:r>
@@ -17813,7 +17670,6 @@
               <w:jc w:val="center"/>
             </w:pPr>
             <w:r>
-              <w:lastRenderedPageBreak/>
               <w:t>2</w:t>
             </w:r>
           </w:p>
@@ -17904,6 +17760,7 @@
               <w:jc w:val="center"/>
             </w:pPr>
             <w:r>
+              <w:lastRenderedPageBreak/>
               <w:t>4</w:t>
             </w:r>
           </w:p>
@@ -18045,56 +17902,27 @@
         <w:t>Proses komunikasi antar bagian (pengawas, gudang, admin, dan pemilik).</w:t>
       </w:r>
     </w:p>
-    <w:p>
-      <w:pPr>
-        <w:spacing w:line="360" w:lineRule="auto"/>
-        <w:rPr>
-          <w:b/>
-          <w:sz w:val="28"/>
-          <w:szCs w:val="28"/>
-        </w:rPr>
-      </w:pPr>
-    </w:p>
+    <w:p/>
     <w:p>
       <w:pPr>
         <w:pStyle w:val="Caption"/>
+        <w:keepNext/>
+        <w:jc w:val="center"/>
         <w:rPr>
           <w:b/>
           <w:i w:val="0"/>
           <w:color w:val="auto"/>
           <w:sz w:val="24"/>
-          <w:szCs w:val="24"/>
-        </w:rPr>
-      </w:pPr>
-    </w:p>
-    <w:p/>
-    <w:p/>
-    <w:p/>
-    <w:p/>
-    <w:p/>
-    <w:p/>
-    <w:p/>
-    <w:p>
-      <w:pPr>
-        <w:pStyle w:val="Caption"/>
-        <w:keepNext/>
-        <w:jc w:val="center"/>
+        </w:rPr>
+      </w:pPr>
+      <w:bookmarkStart w:id="60" w:name="_Toc234966663"/>
+      <w:r>
         <w:rPr>
           <w:b/>
           <w:i w:val="0"/>
           <w:color w:val="auto"/>
           <w:sz w:val="24"/>
         </w:rPr>
-      </w:pPr>
-      <w:bookmarkStart w:id="60" w:name="_Toc234966663"/>
-      <w:r>
-        <w:rPr>
-          <w:b/>
-          <w:i w:val="0"/>
-          <w:color w:val="auto"/>
-          <w:sz w:val="24"/>
-        </w:rPr>
-        <w:lastRenderedPageBreak/>
         <w:t xml:space="preserve">Tabel 4. </w:t>
       </w:r>
       <w:r>
@@ -18323,6 +18151,7 @@
               <w:jc w:val="center"/>
             </w:pPr>
             <w:r>
+              <w:lastRenderedPageBreak/>
               <w:t>2</w:t>
             </w:r>
           </w:p>
@@ -18473,11 +18302,7 @@
               <w:jc w:val="left"/>
             </w:pPr>
             <w:r>
-              <w:t xml:space="preserve">Pengadaan material dilakukan setelah gudang menginformasikan kekurangan stok kepada admin dan diteruskan </w:t>
-            </w:r>
-            <w:r>
-              <w:lastRenderedPageBreak/>
-              <w:t>kepada pemilik untuk proses persetujuan pembelian.</w:t>
+              <w:t>Pengadaan material dilakukan setelah gudang menginformasikan kekurangan stok kepada admin dan diteruskan kepada pemilik untuk proses persetujuan pembelian.</w:t>
             </w:r>
           </w:p>
         </w:tc>
@@ -18491,7 +18316,6 @@
               <w:jc w:val="left"/>
             </w:pPr>
             <w:r>
-              <w:lastRenderedPageBreak/>
               <w:t>Proses pengadaan membutuhkan waktu cukup lama karena alur komunikasi dilakukan secara manual dan bertahap.</w:t>
             </w:r>
           </w:p>
@@ -18572,6 +18396,7 @@
               <w:jc w:val="center"/>
             </w:pPr>
             <w:r>
+              <w:lastRenderedPageBreak/>
               <w:t>6</w:t>
             </w:r>
           </w:p>
@@ -18765,7 +18590,6 @@
       </w:pPr>
       <w:bookmarkStart w:id="61" w:name="_Toc234967029"/>
       <w:r>
-        <w:lastRenderedPageBreak/>
         <w:t>Wawancara</w:t>
       </w:r>
       <w:bookmarkEnd w:id="61"/>
@@ -18827,6 +18651,7 @@
         <w:spacing w:line="360" w:lineRule="auto"/>
       </w:pPr>
       <w:r>
+        <w:lastRenderedPageBreak/>
         <w:t>Jelaskan proses pencatatan barang masuk dan barang keluar dilakukan dalam kegiatan operasional sehari-hari?</w:t>
       </w:r>
     </w:p>
@@ -18910,7 +18735,6 @@
     </w:p>
     <w:p>
       <w:pPr>
-        <w:pStyle w:val="ListParagraph"/>
         <w:spacing w:line="360" w:lineRule="auto"/>
       </w:pPr>
       <w:r>
@@ -23804,40 +23628,37 @@
           <w:numId w:val="77"/>
         </w:numPr>
         <w:spacing w:line="360" w:lineRule="auto"/>
-        <w:ind w:hanging="720"/>
-      </w:pPr>
-      <w:bookmarkStart w:id="72" w:name="_Toc234967032"/>
+        <w:ind w:left="709" w:hanging="709"/>
+      </w:pPr>
+      <w:bookmarkStart w:id="72" w:name="_Toc234967033"/>
       <w:r>
         <w:lastRenderedPageBreak/>
-        <w:t>Kebutuhan Non-Fungsional</w:t>
+        <w:t>Analisis Aktor Sistem</w:t>
       </w:r>
       <w:bookmarkEnd w:id="72"/>
     </w:p>
     <w:p>
       <w:pPr>
         <w:spacing w:line="360" w:lineRule="auto"/>
-        <w:ind w:firstLine="720"/>
-      </w:pPr>
-      <w:r>
-        <w:t>Kebutuhan non-fungsional merupakan kebutuhan yang berkaitan dengan karakteristik kualitas sistem yang harus dipenuhi agar sistem dapat digunakan secara optimal oleh pengguna. Berbeda dengan kebutuhan fungsional yang menjelaskan fungsi atau layanan yang disediakan sistem, kebutuhan non-fungsional menjelaskan bagaimana sistem harus bekerja, seperti aspek kemudahan penggunaan (usability), kinerja (performance), keamanan (security), kompatibilitas (compatibility), dan ketersediaan (availability).</w:t>
-      </w:r>
-    </w:p>
-    <w:p>
-      <w:pPr>
-        <w:spacing w:line="360" w:lineRule="auto"/>
-        <w:ind w:firstLine="720"/>
-      </w:pPr>
-      <w:r>
-        <w:t>Kebutuhan non-fungsional dalam penelitian ini diperoleh melalui proses analisis terhadap hasil observasi dan wawancara yang telah dilakukan kepada pemilik usaha, staf administrasi, staf gudang, dan pengawas lapangan. Analisis dilakukan dengan mengidentifikasi harapan pengguna mengenai karakteristik sistem yang diinginkan selama mendukung proses pengecekan stok dan pengadaan material. Informasi tersebut kemudian dikelompokkan berdasarkan aspek kualitas perangkat lunak sehingga diperoleh kebutuhan non-fungsional yang menjadi acuan dalam perancangan model sistem.</w:t>
+        <w:ind w:firstLine="709"/>
+      </w:pPr>
+      <w:r>
+        <w:t>Setelah kebutuhan fungsional dan non-fungsional berhasil diidentifikasi, tahap selanjutnya adalah menentukan aktor yang akan berinteraksi dengan sistem. Penentuan aktor dilakukan melalui analisis terhadap hasil wawancara dan observasi dengan mengidentifikasi pihak-pihak yang terlibat secara langsung dalam proses pengecekan stok dan pengadaan material. Setiap stakeholder dianalisis berdasarkan tugas, tanggung jawab, serta aktivitas yang dilakukan selama proses bisnis berlangsung. Dari hasil analisis tersebut kemudian ditentukan peran masing-masing stakeholder sebagai aktor yang akan berinteraksi dengan sistem beserta hak akses yang dimilikinya.</w:t>
       </w:r>
     </w:p>
     <w:p>
       <w:pPr>
         <w:spacing w:after="240" w:line="360" w:lineRule="auto"/>
-        <w:ind w:firstLine="720"/>
-      </w:pPr>
-      <w:r>
-        <w:t>Untuk memberikan gambaran mengenai proses analisis yang dilakukan, hasil transformasi dari temuan wawancara menjadi kebutuhan non-fungsional disajikan pada Tabel 4.11.</w:t>
+        <w:ind w:firstLine="709"/>
+      </w:pPr>
+      <w:r>
+        <w:t>Proses transformasi hasil wawancara menjadi aktor sistem disajikan pada Tabel 4.1</w:t>
+      </w:r>
+      <w:r>
+        <w:t>2</w:t>
+      </w:r>
+      <w:r>
+        <w:t>.</w:t>
       </w:r>
     </w:p>
     <w:p>
@@ -23848,12 +23669,11 @@
         <w:rPr>
           <w:b/>
           <w:i w:val="0"/>
-          <w:color w:val="auto"/>
           <w:sz w:val="24"/>
           <w:szCs w:val="24"/>
         </w:rPr>
       </w:pPr>
-      <w:bookmarkStart w:id="73" w:name="_Toc234966672"/>
+      <w:bookmarkStart w:id="73" w:name="_Toc234966673"/>
       <w:r>
         <w:rPr>
           <w:b/>
@@ -23903,7 +23723,7 @@
           <w:sz w:val="24"/>
           <w:szCs w:val="24"/>
         </w:rPr>
-        <w:t>11</w:t>
+        <w:t>12</w:t>
       </w:r>
       <w:r>
         <w:rPr>
@@ -23923,543 +23743,9 @@
           <w:sz w:val="24"/>
           <w:szCs w:val="24"/>
         </w:rPr>
-        <w:t xml:space="preserve"> Kebutuhan Non-Fungsional Sistem</w:t>
+        <w:t xml:space="preserve"> Proses Transformasi Hasil Wawancara Menjadi Aktor Sistem</w:t>
       </w:r>
       <w:bookmarkEnd w:id="73"/>
-    </w:p>
-    <w:tbl>
-      <w:tblPr>
-        <w:tblStyle w:val="TableGrid"/>
-        <w:tblW w:w="0" w:type="auto"/>
-        <w:tblLook w:val="04A0" w:firstRow="1" w:lastRow="0" w:firstColumn="1" w:lastColumn="0" w:noHBand="0" w:noVBand="1"/>
-      </w:tblPr>
-      <w:tblGrid>
-        <w:gridCol w:w="704"/>
-        <w:gridCol w:w="1701"/>
-        <w:gridCol w:w="5522"/>
-      </w:tblGrid>
-      <w:tr>
-        <w:tc>
-          <w:tcPr>
-            <w:tcW w:w="704" w:type="dxa"/>
-          </w:tcPr>
-          <w:p>
-            <w:pPr>
-              <w:spacing w:line="360" w:lineRule="auto"/>
-              <w:jc w:val="center"/>
-              <w:rPr>
-                <w:b/>
-              </w:rPr>
-            </w:pPr>
-            <w:r>
-              <w:rPr>
-                <w:b/>
-              </w:rPr>
-              <w:t>No</w:t>
-            </w:r>
-          </w:p>
-        </w:tc>
-        <w:tc>
-          <w:tcPr>
-            <w:tcW w:w="1701" w:type="dxa"/>
-          </w:tcPr>
-          <w:p>
-            <w:pPr>
-              <w:spacing w:line="360" w:lineRule="auto"/>
-              <w:jc w:val="center"/>
-              <w:rPr>
-                <w:b/>
-              </w:rPr>
-            </w:pPr>
-            <w:r>
-              <w:rPr>
-                <w:b/>
-              </w:rPr>
-              <w:t>Kode</w:t>
-            </w:r>
-          </w:p>
-        </w:tc>
-        <w:tc>
-          <w:tcPr>
-            <w:tcW w:w="5522" w:type="dxa"/>
-          </w:tcPr>
-          <w:p>
-            <w:pPr>
-              <w:spacing w:line="360" w:lineRule="auto"/>
-              <w:jc w:val="center"/>
-              <w:rPr>
-                <w:b/>
-              </w:rPr>
-            </w:pPr>
-            <w:r>
-              <w:rPr>
-                <w:b/>
-              </w:rPr>
-              <w:t>Kebutuhan Non-Fungsional</w:t>
-            </w:r>
-          </w:p>
-        </w:tc>
-      </w:tr>
-      <w:tr>
-        <w:tc>
-          <w:tcPr>
-            <w:tcW w:w="704" w:type="dxa"/>
-          </w:tcPr>
-          <w:p>
-            <w:pPr>
-              <w:spacing w:line="360" w:lineRule="auto"/>
-              <w:jc w:val="center"/>
-            </w:pPr>
-            <w:r>
-              <w:t>1</w:t>
-            </w:r>
-          </w:p>
-        </w:tc>
-        <w:tc>
-          <w:tcPr>
-            <w:tcW w:w="1701" w:type="dxa"/>
-          </w:tcPr>
-          <w:p>
-            <w:pPr>
-              <w:spacing w:line="360" w:lineRule="auto"/>
-              <w:jc w:val="center"/>
-            </w:pPr>
-            <w:r>
-              <w:t>KNF-01</w:t>
-            </w:r>
-          </w:p>
-        </w:tc>
-        <w:tc>
-          <w:tcPr>
-            <w:tcW w:w="5522" w:type="dxa"/>
-          </w:tcPr>
-          <w:p>
-            <w:pPr>
-              <w:spacing w:line="360" w:lineRule="auto"/>
-            </w:pPr>
-            <w:r>
-              <w:t>Sistem memiliki tampilan antarmuka yang sederhana dan mudah dipahami pengguna.</w:t>
-            </w:r>
-          </w:p>
-        </w:tc>
-      </w:tr>
-      <w:tr>
-        <w:tc>
-          <w:tcPr>
-            <w:tcW w:w="704" w:type="dxa"/>
-          </w:tcPr>
-          <w:p>
-            <w:pPr>
-              <w:spacing w:line="360" w:lineRule="auto"/>
-              <w:jc w:val="center"/>
-            </w:pPr>
-            <w:r>
-              <w:t>2</w:t>
-            </w:r>
-          </w:p>
-        </w:tc>
-        <w:tc>
-          <w:tcPr>
-            <w:tcW w:w="1701" w:type="dxa"/>
-          </w:tcPr>
-          <w:p>
-            <w:pPr>
-              <w:spacing w:line="360" w:lineRule="auto"/>
-              <w:jc w:val="center"/>
-            </w:pPr>
-            <w:r>
-              <w:t>KNF-02</w:t>
-            </w:r>
-          </w:p>
-        </w:tc>
-        <w:tc>
-          <w:tcPr>
-            <w:tcW w:w="5522" w:type="dxa"/>
-          </w:tcPr>
-          <w:p>
-            <w:pPr>
-              <w:spacing w:line="360" w:lineRule="auto"/>
-            </w:pPr>
-            <w:r>
-              <w:t>Sistem dapat diakses melalui perangkat laptop maupun smartphone.</w:t>
-            </w:r>
-          </w:p>
-        </w:tc>
-      </w:tr>
-      <w:tr>
-        <w:tc>
-          <w:tcPr>
-            <w:tcW w:w="704" w:type="dxa"/>
-          </w:tcPr>
-          <w:p>
-            <w:pPr>
-              <w:spacing w:line="360" w:lineRule="auto"/>
-              <w:jc w:val="center"/>
-            </w:pPr>
-            <w:r>
-              <w:t>3</w:t>
-            </w:r>
-          </w:p>
-        </w:tc>
-        <w:tc>
-          <w:tcPr>
-            <w:tcW w:w="1701" w:type="dxa"/>
-          </w:tcPr>
-          <w:p>
-            <w:pPr>
-              <w:spacing w:line="360" w:lineRule="auto"/>
-              <w:jc w:val="center"/>
-            </w:pPr>
-            <w:r>
-              <w:t>KNF-03</w:t>
-            </w:r>
-          </w:p>
-        </w:tc>
-        <w:tc>
-          <w:tcPr>
-            <w:tcW w:w="5522" w:type="dxa"/>
-          </w:tcPr>
-          <w:p>
-            <w:pPr>
-              <w:spacing w:line="360" w:lineRule="auto"/>
-            </w:pPr>
-            <w:r>
-              <w:t>Sistem mampu menampilkan informasi stok dan pengadaan secara tepat.</w:t>
-            </w:r>
-          </w:p>
-        </w:tc>
-      </w:tr>
-      <w:tr>
-        <w:tc>
-          <w:tcPr>
-            <w:tcW w:w="704" w:type="dxa"/>
-          </w:tcPr>
-          <w:p>
-            <w:pPr>
-              <w:spacing w:line="360" w:lineRule="auto"/>
-              <w:jc w:val="center"/>
-            </w:pPr>
-            <w:r>
-              <w:t>4</w:t>
-            </w:r>
-          </w:p>
-        </w:tc>
-        <w:tc>
-          <w:tcPr>
-            <w:tcW w:w="1701" w:type="dxa"/>
-          </w:tcPr>
-          <w:p>
-            <w:pPr>
-              <w:spacing w:line="360" w:lineRule="auto"/>
-              <w:jc w:val="center"/>
-            </w:pPr>
-            <w:r>
-              <w:t>KNF-04</w:t>
-            </w:r>
-          </w:p>
-        </w:tc>
-        <w:tc>
-          <w:tcPr>
-            <w:tcW w:w="5522" w:type="dxa"/>
-          </w:tcPr>
-          <w:p>
-            <w:pPr>
-              <w:spacing w:line="360" w:lineRule="auto"/>
-            </w:pPr>
-            <w:r>
-              <w:t>Sistem memiliki navigasi yang mudah digunakan oleh seluruh</w:t>
-            </w:r>
-            <w:r>
-              <w:t xml:space="preserve"> stakeholder.</w:t>
-            </w:r>
-          </w:p>
-        </w:tc>
-      </w:tr>
-      <w:tr>
-        <w:tc>
-          <w:tcPr>
-            <w:tcW w:w="704" w:type="dxa"/>
-          </w:tcPr>
-          <w:p>
-            <w:pPr>
-              <w:spacing w:line="360" w:lineRule="auto"/>
-              <w:jc w:val="center"/>
-            </w:pPr>
-            <w:r>
-              <w:lastRenderedPageBreak/>
-              <w:t>5</w:t>
-            </w:r>
-          </w:p>
-        </w:tc>
-        <w:tc>
-          <w:tcPr>
-            <w:tcW w:w="1701" w:type="dxa"/>
-          </w:tcPr>
-          <w:p>
-            <w:pPr>
-              <w:spacing w:line="360" w:lineRule="auto"/>
-              <w:jc w:val="center"/>
-            </w:pPr>
-            <w:r>
-              <w:t>KNF-05</w:t>
-            </w:r>
-          </w:p>
-        </w:tc>
-        <w:tc>
-          <w:tcPr>
-            <w:tcW w:w="5522" w:type="dxa"/>
-          </w:tcPr>
-          <w:p>
-            <w:pPr>
-              <w:spacing w:line="360" w:lineRule="auto"/>
-            </w:pPr>
-            <w:r>
-              <w:t>Sistem mampu menyimpan data material secara terpusat dan terstruktur.</w:t>
-            </w:r>
-          </w:p>
-        </w:tc>
-      </w:tr>
-      <w:tr>
-        <w:tc>
-          <w:tcPr>
-            <w:tcW w:w="704" w:type="dxa"/>
-          </w:tcPr>
-          <w:p>
-            <w:pPr>
-              <w:spacing w:line="360" w:lineRule="auto"/>
-              <w:jc w:val="center"/>
-            </w:pPr>
-            <w:r>
-              <w:t>6</w:t>
-            </w:r>
-          </w:p>
-        </w:tc>
-        <w:tc>
-          <w:tcPr>
-            <w:tcW w:w="1701" w:type="dxa"/>
-          </w:tcPr>
-          <w:p>
-            <w:pPr>
-              <w:spacing w:line="360" w:lineRule="auto"/>
-              <w:jc w:val="center"/>
-            </w:pPr>
-            <w:r>
-              <w:t>KNF-06</w:t>
-            </w:r>
-          </w:p>
-        </w:tc>
-        <w:tc>
-          <w:tcPr>
-            <w:tcW w:w="5522" w:type="dxa"/>
-          </w:tcPr>
-          <w:p>
-            <w:pPr>
-              <w:spacing w:line="360" w:lineRule="auto"/>
-            </w:pPr>
-            <w:r>
-              <w:t>Sistem mendukung proses monitoring operasional secara lebih efektif.</w:t>
-            </w:r>
-          </w:p>
-        </w:tc>
-      </w:tr>
-      <w:tr>
-        <w:tc>
-          <w:tcPr>
-            <w:tcW w:w="704" w:type="dxa"/>
-          </w:tcPr>
-          <w:p>
-            <w:pPr>
-              <w:spacing w:line="360" w:lineRule="auto"/>
-              <w:jc w:val="center"/>
-            </w:pPr>
-            <w:r>
-              <w:t>7</w:t>
-            </w:r>
-          </w:p>
-        </w:tc>
-        <w:tc>
-          <w:tcPr>
-            <w:tcW w:w="1701" w:type="dxa"/>
-          </w:tcPr>
-          <w:p>
-            <w:pPr>
-              <w:spacing w:line="360" w:lineRule="auto"/>
-              <w:jc w:val="center"/>
-            </w:pPr>
-            <w:r>
-              <w:t>KNF-07</w:t>
-            </w:r>
-          </w:p>
-        </w:tc>
-        <w:tc>
-          <w:tcPr>
-            <w:tcW w:w="5522" w:type="dxa"/>
-          </w:tcPr>
-          <w:p>
-            <w:pPr>
-              <w:spacing w:line="360" w:lineRule="auto"/>
-            </w:pPr>
-            <w:r>
-              <w:t>Sistem dirancang dalam bentuk prototype interaktif menggunakan Figma.</w:t>
-            </w:r>
-          </w:p>
-        </w:tc>
-      </w:tr>
-    </w:tbl>
-    <w:p>
-      <w:pPr>
-        <w:spacing w:line="360" w:lineRule="auto"/>
-      </w:pPr>
-    </w:p>
-    <w:p>
-      <w:pPr>
-        <w:spacing w:after="240" w:line="360" w:lineRule="auto"/>
-        <w:ind w:firstLine="720"/>
-      </w:pPr>
-      <w:r>
-        <w:t>Kebutuhan</w:t>
-      </w:r>
-      <w:r>
-        <w:t xml:space="preserve"> </w:t>
-      </w:r>
-      <w:r>
-        <w:t>non-</w:t>
-      </w:r>
-      <w:r>
-        <w:t xml:space="preserve">fungsional ini menjadi dasar untuk menciptakan antarmuka dan prototipe sistem guna memenuhi kebutuhan pengguna di lapangan. Selain itu, kemudahan penggunaan merupakan prioritas utama karena sistem ini akan digunakan oleh </w:t>
-      </w:r>
-      <w:r>
-        <w:t>stakeholder</w:t>
-      </w:r>
-      <w:r>
-        <w:t xml:space="preserve"> yang memiliki tugas operasional yang berbeda.</w:t>
-      </w:r>
-    </w:p>
-    <w:p>
-      <w:pPr>
-        <w:pStyle w:val="Heading3"/>
-        <w:numPr>
-          <w:ilvl w:val="0"/>
-          <w:numId w:val="77"/>
-        </w:numPr>
-        <w:spacing w:line="360" w:lineRule="auto"/>
-        <w:ind w:left="709" w:hanging="709"/>
-      </w:pPr>
-      <w:bookmarkStart w:id="74" w:name="_Toc234967033"/>
-      <w:r>
-        <w:t>Analisis Aktor Sistem</w:t>
-      </w:r>
-      <w:bookmarkEnd w:id="74"/>
-    </w:p>
-    <w:p>
-      <w:pPr>
-        <w:spacing w:line="360" w:lineRule="auto"/>
-        <w:ind w:firstLine="709"/>
-      </w:pPr>
-      <w:r>
-        <w:t>Setelah kebutuhan fungsional dan non-fungsional berhasil diidentifikasi, tahap selanjutnya adalah menentukan aktor yang akan berinteraksi dengan sistem. Penentuan aktor dilakukan melalui analisis terhadap hasil wawancara dan observasi dengan mengidentifikasi pihak-pihak yang terlibat secara langsung dalam proses pengecekan stok dan pengadaan material. Setiap stakeholder dianalisis berdasarkan tugas, tanggung jawab, serta aktivitas yang dilakukan selama proses bisnis berlangsung. Dari hasil analisis tersebut kemudian ditentukan peran masing-masing stakeholder sebagai aktor yang akan berinteraksi dengan sistem beserta hak akses yang dimilikinya.</w:t>
-      </w:r>
-    </w:p>
-    <w:p>
-      <w:pPr>
-        <w:spacing w:after="240" w:line="360" w:lineRule="auto"/>
-        <w:ind w:firstLine="709"/>
-      </w:pPr>
-      <w:r>
-        <w:t>Proses transformasi hasil wawancara menjadi aktor sistem disajikan pada Tabel 4.1</w:t>
-      </w:r>
-      <w:r>
-        <w:t>2</w:t>
-      </w:r>
-      <w:r>
-        <w:t>.</w:t>
-      </w:r>
-    </w:p>
-    <w:p>
-      <w:pPr>
-        <w:pStyle w:val="Caption"/>
-        <w:keepNext/>
-        <w:jc w:val="center"/>
-        <w:rPr>
-          <w:b/>
-          <w:i w:val="0"/>
-          <w:sz w:val="24"/>
-          <w:szCs w:val="24"/>
-        </w:rPr>
-      </w:pPr>
-      <w:bookmarkStart w:id="75" w:name="_Toc234966673"/>
-      <w:r>
-        <w:rPr>
-          <w:b/>
-          <w:i w:val="0"/>
-          <w:color w:val="auto"/>
-          <w:sz w:val="24"/>
-          <w:szCs w:val="24"/>
-        </w:rPr>
-        <w:t xml:space="preserve">Tabel 4. </w:t>
-      </w:r>
-      <w:r>
-        <w:rPr>
-          <w:b/>
-          <w:i w:val="0"/>
-          <w:color w:val="auto"/>
-          <w:sz w:val="24"/>
-          <w:szCs w:val="24"/>
-        </w:rPr>
-        <w:fldChar w:fldCharType="begin"/>
-      </w:r>
-      <w:r>
-        <w:rPr>
-          <w:b/>
-          <w:i w:val="0"/>
-          <w:color w:val="auto"/>
-          <w:sz w:val="24"/>
-          <w:szCs w:val="24"/>
-        </w:rPr>
-        <w:instrText xml:space="preserve"> SEQ Tabel_4. \* ARABIC </w:instrText>
-      </w:r>
-      <w:r>
-        <w:rPr>
-          <w:b/>
-          <w:i w:val="0"/>
-          <w:color w:val="auto"/>
-          <w:sz w:val="24"/>
-          <w:szCs w:val="24"/>
-        </w:rPr>
-        <w:fldChar w:fldCharType="separate"/>
-      </w:r>
-      <w:r>
-        <w:rPr>
-          <w:b/>
-          <w:i w:val="0"/>
-          <w:noProof/>
-          <w:color w:val="auto"/>
-          <w:sz w:val="24"/>
-          <w:szCs w:val="24"/>
-        </w:rPr>
-        <w:t>12</w:t>
-      </w:r>
-      <w:r>
-        <w:rPr>
-          <w:b/>
-          <w:i w:val="0"/>
-          <w:color w:val="auto"/>
-          <w:sz w:val="24"/>
-          <w:szCs w:val="24"/>
-        </w:rPr>
-        <w:fldChar w:fldCharType="end"/>
-      </w:r>
-      <w:r>
-        <w:rPr>
-          <w:b/>
-          <w:i w:val="0"/>
-          <w:color w:val="auto"/>
-          <w:sz w:val="24"/>
-          <w:szCs w:val="24"/>
-        </w:rPr>
-        <w:t xml:space="preserve"> Proses Transformasi Hasil Wawancara Menjadi Aktor Sistem</w:t>
-      </w:r>
-      <w:bookmarkEnd w:id="75"/>
     </w:p>
     <w:tbl>
       <w:tblPr>
@@ -24625,7 +23911,6 @@
               <w:jc w:val="left"/>
             </w:pPr>
             <w:r>
-              <w:lastRenderedPageBreak/>
               <w:t>2</w:t>
             </w:r>
           </w:p>
@@ -24780,7 +24065,11 @@
               <w:jc w:val="left"/>
             </w:pPr>
             <w:r>
-              <w:t>Pengawas lapangan menggunakan sistem untuk mengajukan permintaan material.</w:t>
+              <w:t xml:space="preserve">Pengawas lapangan menggunakan sistem </w:t>
+            </w:r>
+            <w:r>
+              <w:lastRenderedPageBreak/>
+              <w:t>untuk mengajukan permintaan material.</w:t>
             </w:r>
           </w:p>
         </w:tc>
@@ -24795,6 +24084,7 @@
               <w:jc w:val="left"/>
             </w:pPr>
             <w:r>
+              <w:lastRenderedPageBreak/>
               <w:t>Pengawas Lapangan</w:t>
             </w:r>
           </w:p>
@@ -24823,8 +24113,6 @@
       <w:r>
         <w:t xml:space="preserve"> Analisis Aktor Sistem</w:t>
       </w:r>
-      <w:bookmarkStart w:id="76" w:name="_GoBack"/>
-      <w:bookmarkEnd w:id="76"/>
       <w:r>
         <w:t>.</w:t>
       </w:r>
@@ -24842,7 +24130,7 @@
           <w:szCs w:val="24"/>
         </w:rPr>
       </w:pPr>
-      <w:bookmarkStart w:id="77" w:name="_Toc234966674"/>
+      <w:bookmarkStart w:id="74" w:name="_Toc234966674"/>
       <w:r>
         <w:rPr>
           <w:b/>
@@ -24914,7 +24202,7 @@
         </w:rPr>
         <w:t xml:space="preserve"> Analisis Aktor Sistem</w:t>
       </w:r>
-      <w:bookmarkEnd w:id="77"/>
+      <w:bookmarkEnd w:id="74"/>
     </w:p>
     <w:tbl>
       <w:tblPr>
@@ -25267,7 +24555,6 @@
         <w:ind w:firstLine="720"/>
       </w:pPr>
       <w:r>
-        <w:lastRenderedPageBreak/>
         <w:t>Analisis aktor sistem digunakan sebagai dasar dalam penyusunan Use Case Diagram dan perancangan hak akses pengguna pada prototype sistem.</w:t>
       </w:r>
     </w:p>
@@ -25281,11 +24568,11 @@
         <w:spacing w:line="360" w:lineRule="auto"/>
         <w:ind w:hanging="720"/>
       </w:pPr>
-      <w:bookmarkStart w:id="78" w:name="_Toc234967034"/>
+      <w:bookmarkStart w:id="75" w:name="_Toc234967034"/>
       <w:r>
         <w:t>User Stories</w:t>
       </w:r>
-      <w:bookmarkEnd w:id="78"/>
+      <w:bookmarkEnd w:id="75"/>
     </w:p>
     <w:p>
       <w:pPr>
@@ -25315,6 +24602,7 @@
         <w:ind w:left="426"/>
       </w:pPr>
       <w:r>
+        <w:lastRenderedPageBreak/>
         <w:t>Sebagai (aktor), saya ingin (kebutuhan), sehingga (manfaat yang diperoleh).</w:t>
       </w:r>
     </w:p>
@@ -25349,7 +24637,7 @@
           <w:szCs w:val="24"/>
         </w:rPr>
       </w:pPr>
-      <w:bookmarkStart w:id="79" w:name="_Toc234966675"/>
+      <w:bookmarkStart w:id="76" w:name="_Toc234966675"/>
       <w:r>
         <w:rPr>
           <w:b/>
@@ -25421,7 +24709,7 @@
         </w:rPr>
         <w:t xml:space="preserve"> Proses Transformasi Hasil Wawancara Menjadi User Story</w:t>
       </w:r>
-      <w:bookmarkEnd w:id="79"/>
+      <w:bookmarkEnd w:id="76"/>
     </w:p>
     <w:tbl>
       <w:tblPr>
@@ -25603,7 +24891,6 @@
               <w:jc w:val="left"/>
             </w:pPr>
             <w:r>
-              <w:lastRenderedPageBreak/>
               <w:t>2</w:t>
             </w:r>
           </w:p>
@@ -25751,7 +25038,11 @@
               <w:jc w:val="left"/>
             </w:pPr>
             <w:r>
-              <w:t>Pemilik harus memberikan persetujuan pembelian.</w:t>
+              <w:t xml:space="preserve">Pemilik harus memberikan </w:t>
+            </w:r>
+            <w:r>
+              <w:lastRenderedPageBreak/>
+              <w:t>persetujuan pembelian.</w:t>
             </w:r>
           </w:p>
         </w:tc>
@@ -25766,7 +25057,12 @@
               <w:jc w:val="left"/>
             </w:pPr>
             <w:r>
-              <w:t>Pemilik membutuhkan media untuk memproses persetujuan.</w:t>
+              <w:lastRenderedPageBreak/>
+              <w:t xml:space="preserve">Pemilik membutuhkan media untuk </w:t>
+            </w:r>
+            <w:r>
+              <w:lastRenderedPageBreak/>
+              <w:t>memproses persetujuan.</w:t>
             </w:r>
           </w:p>
         </w:tc>
@@ -25785,7 +25081,16 @@
                 <w:rStyle w:val="Strong"/>
                 <w:b w:val="0"/>
               </w:rPr>
-              <w:t>Sebagai Pemilik, saya ingin memberikan persetujuan pengadaan material sehingga proses pembelian dapat segera dilakukan.</w:t>
+              <w:lastRenderedPageBreak/>
+              <w:t xml:space="preserve">Sebagai Pemilik, saya ingin memberikan persetujuan pengadaan material sehingga </w:t>
+            </w:r>
+            <w:r>
+              <w:rPr>
+                <w:rStyle w:val="Strong"/>
+                <w:b w:val="0"/>
+              </w:rPr>
+              <w:lastRenderedPageBreak/>
+              <w:t>proses pembelian dapat segera dilakukan.</w:t>
             </w:r>
           </w:p>
         </w:tc>
@@ -25802,6 +25107,7 @@
               <w:jc w:val="left"/>
             </w:pPr>
             <w:r>
+              <w:lastRenderedPageBreak/>
               <w:t>5</w:t>
             </w:r>
           </w:p>
@@ -25908,7 +25214,7 @@
           <w:szCs w:val="24"/>
         </w:rPr>
       </w:pPr>
-      <w:bookmarkStart w:id="80" w:name="_Toc234966676"/>
+      <w:bookmarkStart w:id="77" w:name="_Toc234966676"/>
       <w:r>
         <w:rPr>
           <w:b/>
@@ -25917,7 +25223,6 @@
           <w:sz w:val="24"/>
           <w:szCs w:val="24"/>
         </w:rPr>
-        <w:lastRenderedPageBreak/>
         <w:t xml:space="preserve">Tabel 4. </w:t>
       </w:r>
       <w:r>
@@ -25981,7 +25286,7 @@
         </w:rPr>
         <w:t xml:space="preserve"> User Stories Sistem</w:t>
       </w:r>
-      <w:bookmarkEnd w:id="80"/>
+      <w:bookmarkEnd w:id="77"/>
     </w:p>
     <w:tbl>
       <w:tblPr>
@@ -26235,6 +25540,7 @@
               <w:jc w:val="center"/>
             </w:pPr>
             <w:r>
+              <w:lastRenderedPageBreak/>
               <w:t>5</w:t>
             </w:r>
           </w:p>
@@ -26333,11 +25639,11 @@
         <w:spacing w:line="360" w:lineRule="auto"/>
         <w:ind w:hanging="578"/>
       </w:pPr>
-      <w:bookmarkStart w:id="81" w:name="_Toc234967035"/>
+      <w:bookmarkStart w:id="78" w:name="_Toc234967035"/>
       <w:r>
         <w:t>Pengembangan Model Sistem Menggunakan Metode Personal Extreme Programming (PXP)</w:t>
       </w:r>
-      <w:bookmarkEnd w:id="81"/>
+      <w:bookmarkEnd w:id="78"/>
     </w:p>
     <w:p>
       <w:pPr>
@@ -26345,11 +25651,7 @@
         <w:ind w:firstLine="720"/>
       </w:pPr>
       <w:r>
-        <w:t xml:space="preserve">Pengembangan model sistem pada penelitian ini dilakukan menggunakan metode Personal Extreme Programming (PXP). Metode ini dipilih karena proses pengembangan dilakukan oleh satu orang pengembang (solo developer) serta memiliki fleksibilitas yang tinggi dalam menyesuaikan kebutuhan pengguna. </w:t>
-      </w:r>
-      <w:r>
-        <w:lastRenderedPageBreak/>
-        <w:t>Tahapan pengembangan meliputi Requirements, Planning, Iteration Initialization, Design, Implementation, System Testing, dan Retrospective.</w:t>
+        <w:t>Pengembangan model sistem pada penelitian ini dilakukan menggunakan metode Personal Extreme Programming (PXP). Metode ini dipilih karena proses pengembangan dilakukan oleh satu orang pengembang (solo developer) serta memiliki fleksibilitas yang tinggi dalam menyesuaikan kebutuhan pengguna. Tahapan pengembangan meliputi Requirements, Planning, Iteration Initialization, Design, Implementation, System Testing, dan Retrospective.</w:t>
       </w:r>
     </w:p>
     <w:p>
@@ -26362,11 +25664,11 @@
         <w:spacing w:line="360" w:lineRule="auto"/>
         <w:ind w:hanging="720"/>
       </w:pPr>
-      <w:bookmarkStart w:id="82" w:name="_Toc234967036"/>
+      <w:bookmarkStart w:id="79" w:name="_Toc234967036"/>
       <w:r>
         <w:t>Requirements</w:t>
       </w:r>
-      <w:bookmarkEnd w:id="82"/>
+      <w:bookmarkEnd w:id="79"/>
     </w:p>
     <w:p>
       <w:pPr>
@@ -26391,6 +25693,7 @@
         <w:spacing w:line="360" w:lineRule="auto"/>
       </w:pPr>
       <w:r>
+        <w:lastRenderedPageBreak/>
         <w:t>Penyusunan User Story dilakukan dengan format:</w:t>
       </w:r>
     </w:p>
@@ -26445,7 +25748,7 @@
           <w:szCs w:val="24"/>
         </w:rPr>
       </w:pPr>
-      <w:bookmarkStart w:id="83" w:name="_Toc234966677"/>
+      <w:bookmarkStart w:id="80" w:name="_Toc234966677"/>
       <w:r>
         <w:rPr>
           <w:b/>
@@ -26517,7 +25820,7 @@
         </w:rPr>
         <w:t xml:space="preserve"> User Stories</w:t>
       </w:r>
-      <w:bookmarkEnd w:id="83"/>
+      <w:bookmarkEnd w:id="80"/>
     </w:p>
     <w:tbl>
       <w:tblPr>
@@ -26648,7 +25951,6 @@
               <w:jc w:val="center"/>
             </w:pPr>
             <w:r>
-              <w:lastRenderedPageBreak/>
               <w:t>US-0</w:t>
             </w:r>
             <w:r>
@@ -26829,6 +26131,7 @@
               <w:jc w:val="center"/>
             </w:pPr>
             <w:r>
+              <w:lastRenderedPageBreak/>
               <w:t>US-06</w:t>
             </w:r>
           </w:p>
@@ -26876,11 +26179,11 @@
         <w:spacing w:line="360" w:lineRule="auto"/>
         <w:ind w:hanging="720"/>
       </w:pPr>
-      <w:bookmarkStart w:id="84" w:name="_Toc234967037"/>
+      <w:bookmarkStart w:id="81" w:name="_Toc234967037"/>
       <w:r>
         <w:t>Planning</w:t>
       </w:r>
-      <w:bookmarkEnd w:id="84"/>
+      <w:bookmarkEnd w:id="81"/>
     </w:p>
     <w:p>
       <w:pPr>
@@ -26897,11 +26200,7 @@
         <w:ind w:firstLine="720"/>
       </w:pPr>
       <w:r>
-        <w:t xml:space="preserve">Penentuan prioritas dilakukan melalui diskusi bersama stakeholder yang terdiri atas pemilik usaha, staf administrasi, staf gudang, dan pengawas lapangan. Setiap fitur dievaluasi berdasarkan tingkat urgensi terhadap proses bisnis, frekuensi penggunaan dalam kegiatan operasional, serta dampaknya terhadap penyelesaian permasalahan yang ditemukan selama observasi dan wawancara. Hasil evaluasi </w:t>
-      </w:r>
-      <w:r>
-        <w:lastRenderedPageBreak/>
-        <w:t>kemudian digunakan untuk mengelompokkan fitur ke dalam kategori prioritas tinggi, sedang, atau rendah.</w:t>
+        <w:t>Penentuan prioritas dilakukan melalui diskusi bersama stakeholder yang terdiri atas pemilik usaha, staf administrasi, staf gudang, dan pengawas lapangan. Setiap fitur dievaluasi berdasarkan tingkat urgensi terhadap proses bisnis, frekuensi penggunaan dalam kegiatan operasional, serta dampaknya terhadap penyelesaian permasalahan yang ditemukan selama observasi dan wawancara. Hasil evaluasi kemudian digunakan untuk mengelompokkan fitur ke dalam kategori prioritas tinggi, sedang, atau rendah.</w:t>
       </w:r>
     </w:p>
     <w:p>
@@ -26916,7 +26215,7 @@
           <w:szCs w:val="24"/>
         </w:rPr>
       </w:pPr>
-      <w:bookmarkStart w:id="85" w:name="_Toc234966678"/>
+      <w:bookmarkStart w:id="82" w:name="_Toc234966678"/>
       <w:r>
         <w:rPr>
           <w:b/>
@@ -26988,7 +26287,7 @@
         </w:rPr>
         <w:t xml:space="preserve"> Proses Planning Penentuan Prioritas Fitur</w:t>
       </w:r>
-      <w:bookmarkEnd w:id="85"/>
+      <w:bookmarkEnd w:id="82"/>
     </w:p>
     <w:tbl>
       <w:tblPr>
@@ -27290,6 +26589,7 @@
               <w:rPr>
                 <w:rFonts w:cs="Times New Roman"/>
               </w:rPr>
+              <w:lastRenderedPageBreak/>
               <w:t>2</w:t>
             </w:r>
           </w:p>
@@ -27674,7 +26974,6 @@
               <w:rPr>
                 <w:rFonts w:cs="Times New Roman"/>
               </w:rPr>
-              <w:lastRenderedPageBreak/>
               <w:t>5</w:t>
             </w:r>
           </w:p>
@@ -27973,7 +27272,14 @@
               <w:rPr>
                 <w:rFonts w:cs="Times New Roman"/>
               </w:rPr>
-              <w:t>Informasi detail material diperlukan sebagai referensi.</w:t>
+              <w:t xml:space="preserve">Informasi detail material </w:t>
+            </w:r>
+            <w:r>
+              <w:rPr>
+                <w:rFonts w:cs="Times New Roman"/>
+              </w:rPr>
+              <w:lastRenderedPageBreak/>
+              <w:t>diperlukan sebagai referensi.</w:t>
             </w:r>
           </w:p>
         </w:tc>
@@ -27994,6 +27300,7 @@
               <w:rPr>
                 <w:rFonts w:cs="Times New Roman"/>
               </w:rPr>
+              <w:lastRenderedPageBreak/>
               <w:t>Data Material</w:t>
             </w:r>
           </w:p>
@@ -28036,7 +27343,14 @@
               <w:rPr>
                 <w:rFonts w:cs="Times New Roman"/>
               </w:rPr>
-              <w:t>Menjadi data master yang digunakan fitur lain.</w:t>
+              <w:t xml:space="preserve">Menjadi data master yang </w:t>
+            </w:r>
+            <w:r>
+              <w:rPr>
+                <w:rFonts w:cs="Times New Roman"/>
+              </w:rPr>
+              <w:lastRenderedPageBreak/>
+              <w:t>digunakan fitur lain.</w:t>
             </w:r>
           </w:p>
         </w:tc>
@@ -28059,6 +27373,7 @@
               <w:rPr>
                 <w:rFonts w:cs="Times New Roman"/>
               </w:rPr>
+              <w:lastRenderedPageBreak/>
               <w:t>8</w:t>
             </w:r>
           </w:p>
@@ -28309,7 +27624,6 @@
         <w:ind w:firstLine="720"/>
       </w:pPr>
       <w:r>
-        <w:lastRenderedPageBreak/>
         <w:t>Berdasarkan hasil proses planning, diperoleh daftar fitur yang akan dikembangkan beserta tingkat prioritasnya. Fitur dengan prioritas tinggi dipilih karena mendukung aktivitas operasional utama, seperti pengecekan stok, pencatatan material, pengajuan, dan persetujuan pengadaan. Sementara itu, fitur dengan prioritas sedang merupakan fitur pendukung yang meningkatkan efektivitas pengelolaan data dan proses monitoring. Penentuan prioritas tersebut menjadi dasar dalam penyusunan rancangan model sistem pada tahapan berikutnya dalam metode Personal Extreme Programming (PXP).</w:t>
       </w:r>
     </w:p>
@@ -28335,7 +27649,7 @@
           <w:szCs w:val="24"/>
         </w:rPr>
       </w:pPr>
-      <w:bookmarkStart w:id="86" w:name="_Toc234966679"/>
+      <w:bookmarkStart w:id="83" w:name="_Toc234966679"/>
       <w:r>
         <w:rPr>
           <w:b/>
@@ -28407,7 +27721,7 @@
         </w:rPr>
         <w:t xml:space="preserve"> Prioritas Pengembangan Fitur</w:t>
       </w:r>
-      <w:bookmarkEnd w:id="86"/>
+      <w:bookmarkEnd w:id="83"/>
     </w:p>
     <w:tbl>
       <w:tblPr>
@@ -28535,6 +27849,7 @@
               <w:jc w:val="center"/>
             </w:pPr>
             <w:r>
+              <w:lastRenderedPageBreak/>
               <w:t>FT-02</w:t>
             </w:r>
           </w:p>
@@ -28885,11 +28200,11 @@
         <w:spacing w:line="360" w:lineRule="auto"/>
         <w:ind w:hanging="720"/>
       </w:pPr>
-      <w:bookmarkStart w:id="87" w:name="_Toc234967038"/>
+      <w:bookmarkStart w:id="84" w:name="_Toc234967038"/>
       <w:r>
         <w:t>Iteration Initialization</w:t>
       </w:r>
-      <w:bookmarkEnd w:id="87"/>
+      <w:bookmarkEnd w:id="84"/>
     </w:p>
     <w:p>
       <w:pPr>
@@ -28897,11 +28212,7 @@
         <w:ind w:firstLine="720"/>
       </w:pPr>
       <w:r>
-        <w:t xml:space="preserve">Setelah prioritas pengembangan fitur ditetapkan pada tahap Planning, langkah selanjutnya dalam metode Personal Extreme Programming (PXP) adalah menentukan ruang lingkup setiap iterasi pengembangan. Penentuan iterasi </w:t>
-      </w:r>
-      <w:r>
-        <w:lastRenderedPageBreak/>
-        <w:t>bertujuan untuk membagi proses pengembangan menjadi beberapa tahapan yang lebih terstruktur sehingga setiap fitur dapat dirancang secara bertahap sesuai dengan tingkat prioritas dan keterkaitannya dengan proses bisnis.</w:t>
+        <w:t>Setelah prioritas pengembangan fitur ditetapkan pada tahap Planning, langkah selanjutnya dalam metode Personal Extreme Programming (PXP) adalah menentukan ruang lingkup setiap iterasi pengembangan. Penentuan iterasi bertujuan untuk membagi proses pengembangan menjadi beberapa tahapan yang lebih terstruktur sehingga setiap fitur dapat dirancang secara bertahap sesuai dengan tingkat prioritas dan keterkaitannya dengan proses bisnis.</w:t>
       </w:r>
     </w:p>
     <w:p>
@@ -28926,7 +28237,7 @@
           <w:szCs w:val="24"/>
         </w:rPr>
       </w:pPr>
-      <w:bookmarkStart w:id="88" w:name="_Toc234966680"/>
+      <w:bookmarkStart w:id="85" w:name="_Toc234966680"/>
       <w:r>
         <w:rPr>
           <w:b/>
@@ -28935,6 +28246,7 @@
           <w:sz w:val="24"/>
           <w:szCs w:val="24"/>
         </w:rPr>
+        <w:lastRenderedPageBreak/>
         <w:t xml:space="preserve">Tabel 4. </w:t>
       </w:r>
       <w:r>
@@ -28998,7 +28310,7 @@
         </w:rPr>
         <w:t xml:space="preserve"> Proses Penentuan Ruang Lingkup Iterasi</w:t>
       </w:r>
-      <w:bookmarkEnd w:id="88"/>
+      <w:bookmarkEnd w:id="85"/>
     </w:p>
     <w:tbl>
       <w:tblPr>
@@ -29353,7 +28665,6 @@
               <w:jc w:val="left"/>
             </w:pPr>
             <w:r>
-              <w:lastRenderedPageBreak/>
               <w:t>4</w:t>
             </w:r>
           </w:p>
@@ -29585,6 +28896,7 @@
               <w:jc w:val="left"/>
             </w:pPr>
             <w:r>
+              <w:lastRenderedPageBreak/>
               <w:t>7</w:t>
             </w:r>
           </w:p>
@@ -29687,7 +28999,7 @@
           <w:szCs w:val="24"/>
         </w:rPr>
       </w:pPr>
-      <w:bookmarkStart w:id="89" w:name="_Toc234966681"/>
+      <w:bookmarkStart w:id="86" w:name="_Toc234966681"/>
       <w:r>
         <w:rPr>
           <w:b/>
@@ -29696,7 +29008,6 @@
           <w:sz w:val="24"/>
           <w:szCs w:val="24"/>
         </w:rPr>
-        <w:lastRenderedPageBreak/>
         <w:t xml:space="preserve">Tabel 4. </w:t>
       </w:r>
       <w:r>
@@ -29760,7 +29071,7 @@
         </w:rPr>
         <w:t xml:space="preserve"> Ruang Lingkup Iterasi</w:t>
       </w:r>
-      <w:bookmarkEnd w:id="89"/>
+      <w:bookmarkEnd w:id="86"/>
     </w:p>
     <w:tbl>
       <w:tblPr>
@@ -30033,11 +29344,11 @@
         <w:spacing w:line="360" w:lineRule="auto"/>
         <w:ind w:hanging="720"/>
       </w:pPr>
-      <w:bookmarkStart w:id="90" w:name="_Toc234967039"/>
+      <w:bookmarkStart w:id="87" w:name="_Toc234967039"/>
       <w:r>
         <w:t>Design</w:t>
       </w:r>
-      <w:bookmarkEnd w:id="90"/>
+      <w:bookmarkEnd w:id="87"/>
     </w:p>
     <w:p>
       <w:pPr>
@@ -30045,7 +29356,11 @@
         <w:ind w:firstLine="720"/>
       </w:pPr>
       <w:r>
-        <w:t xml:space="preserve">Tahap perancangan dilakukan untuk menerjemahkan persyaratan sistem yang diperoleh pada tahap sebelumnya menjadi rencana sistem yang terstruktur. Perancangan ini bertujuan untuk menunjukkan alur proses, cara pengguna berinteraksi dengan sistem, serta struktur data yang digunakan dalam model sistem untuk pengecekan stok dan pengadaan bahan. Dalam penelitian ini, perancangan dilakukan dengan menggunakan Unified Modeling Language (UML), yang meliputi Diagram Use Case, </w:t>
+        <w:t xml:space="preserve">Tahap perancangan dilakukan untuk menerjemahkan persyaratan sistem yang diperoleh pada tahap sebelumnya menjadi rencana sistem yang terstruktur. Perancangan ini bertujuan untuk menunjukkan alur proses, cara pengguna </w:t>
+      </w:r>
+      <w:r>
+        <w:lastRenderedPageBreak/>
+        <w:t xml:space="preserve">berinteraksi dengan sistem, serta struktur data yang digunakan dalam model sistem untuk pengecekan stok dan pengadaan bahan. Dalam penelitian ini, perancangan dilakukan dengan menggunakan Unified Modeling Language (UML), yang meliputi Diagram Use Case, </w:t>
       </w:r>
       <w:r>
         <w:t xml:space="preserve">Activity </w:t>
@@ -30072,7 +29387,7 @@
           <w:szCs w:val="24"/>
         </w:rPr>
       </w:pPr>
-      <w:bookmarkStart w:id="91" w:name="_Toc234966682"/>
+      <w:bookmarkStart w:id="88" w:name="_Toc234966682"/>
       <w:r>
         <w:rPr>
           <w:b/>
@@ -30144,7 +29459,7 @@
         </w:rPr>
         <w:t xml:space="preserve"> Daftar Diagram UML</w:t>
       </w:r>
-      <w:bookmarkEnd w:id="91"/>
+      <w:bookmarkEnd w:id="88"/>
     </w:p>
     <w:tbl>
       <w:tblPr>
@@ -30373,7 +29688,6 @@
         <w:rPr>
           <w:b/>
         </w:rPr>
-        <w:lastRenderedPageBreak/>
         <w:t>Use Case Diagram</w:t>
       </w:r>
     </w:p>
@@ -30430,7 +29744,7 @@
                     </pic:cNvPicPr>
                   </pic:nvPicPr>
                   <pic:blipFill>
-                    <a:blip r:embed="rId20">
+                    <a:blip r:embed="rId21">
                       <a:extLst>
                         <a:ext uri="{28A0092B-C50C-407E-A947-70E740481C1C}">
                           <a14:useLocalDpi xmlns:a14="http://schemas.microsoft.com/office/drawing/2010/main" val="0"/>
@@ -30474,7 +29788,7 @@
           <w:szCs w:val="24"/>
         </w:rPr>
       </w:pPr>
-      <w:bookmarkStart w:id="92" w:name="_Toc233127903"/>
+      <w:bookmarkStart w:id="89" w:name="_Toc233127903"/>
       <w:r>
         <w:rPr>
           <w:b/>
@@ -30546,7 +29860,7 @@
         </w:rPr>
         <w:t xml:space="preserve"> Use Case Diagram Sistem Pengecekan Stok dan Pengadaan Material</w:t>
       </w:r>
-      <w:bookmarkEnd w:id="92"/>
+      <w:bookmarkEnd w:id="89"/>
     </w:p>
     <w:p>
       <w:pPr>
@@ -30818,7 +30132,7 @@
                     </pic:cNvPicPr>
                   </pic:nvPicPr>
                   <pic:blipFill>
-                    <a:blip r:embed="rId21">
+                    <a:blip r:embed="rId22">
                       <a:extLst>
                         <a:ext uri="{28A0092B-C50C-407E-A947-70E740481C1C}">
                           <a14:useLocalDpi xmlns:a14="http://schemas.microsoft.com/office/drawing/2010/main" val="0"/>
@@ -30862,7 +30176,7 @@
           <w:szCs w:val="24"/>
         </w:rPr>
       </w:pPr>
-      <w:bookmarkStart w:id="93" w:name="_Toc233127904"/>
+      <w:bookmarkStart w:id="90" w:name="_Toc233127904"/>
       <w:r>
         <w:rPr>
           <w:b/>
@@ -30934,7 +30248,7 @@
         </w:rPr>
         <w:t xml:space="preserve"> Activity Diagram Pengajuan Material</w:t>
       </w:r>
-      <w:bookmarkEnd w:id="93"/>
+      <w:bookmarkEnd w:id="90"/>
     </w:p>
     <w:p>
       <w:pPr>
@@ -31000,7 +30314,7 @@
                     </pic:cNvPicPr>
                   </pic:nvPicPr>
                   <pic:blipFill>
-                    <a:blip r:embed="rId22">
+                    <a:blip r:embed="rId23">
                       <a:extLst>
                         <a:ext uri="{28A0092B-C50C-407E-A947-70E740481C1C}">
                           <a14:useLocalDpi xmlns:a14="http://schemas.microsoft.com/office/drawing/2010/main" val="0"/>
@@ -31044,7 +30358,7 @@
           <w:szCs w:val="24"/>
         </w:rPr>
       </w:pPr>
-      <w:bookmarkStart w:id="94" w:name="_Toc233127905"/>
+      <w:bookmarkStart w:id="91" w:name="_Toc233127905"/>
       <w:r>
         <w:rPr>
           <w:b/>
@@ -31116,7 +30430,7 @@
         </w:rPr>
         <w:t xml:space="preserve"> Activity Diagram Pengadaan Material</w:t>
       </w:r>
-      <w:bookmarkEnd w:id="94"/>
+      <w:bookmarkEnd w:id="91"/>
     </w:p>
     <w:p>
       <w:pPr>
@@ -31182,7 +30496,7 @@
                     </pic:cNvPicPr>
                   </pic:nvPicPr>
                   <pic:blipFill>
-                    <a:blip r:embed="rId23">
+                    <a:blip r:embed="rId24">
                       <a:extLst>
                         <a:ext uri="{28A0092B-C50C-407E-A947-70E740481C1C}">
                           <a14:useLocalDpi xmlns:a14="http://schemas.microsoft.com/office/drawing/2010/main" val="0"/>
@@ -31226,7 +30540,7 @@
           <w:szCs w:val="24"/>
         </w:rPr>
       </w:pPr>
-      <w:bookmarkStart w:id="95" w:name="_Toc233127906"/>
+      <w:bookmarkStart w:id="92" w:name="_Toc233127906"/>
       <w:r>
         <w:rPr>
           <w:b/>
@@ -31298,7 +30612,7 @@
         </w:rPr>
         <w:t xml:space="preserve"> Activity Diagram Material Keluar</w:t>
       </w:r>
-      <w:bookmarkEnd w:id="95"/>
+      <w:bookmarkEnd w:id="92"/>
     </w:p>
     <w:p>
       <w:pPr>
@@ -31386,7 +30700,7 @@
                     </pic:cNvPicPr>
                   </pic:nvPicPr>
                   <pic:blipFill>
-                    <a:blip r:embed="rId24">
+                    <a:blip r:embed="rId25">
                       <a:extLst>
                         <a:ext uri="{28A0092B-C50C-407E-A947-70E740481C1C}">
                           <a14:useLocalDpi xmlns:a14="http://schemas.microsoft.com/office/drawing/2010/main" val="0"/>
@@ -31431,7 +30745,7 @@
           <w:szCs w:val="24"/>
         </w:rPr>
       </w:pPr>
-      <w:bookmarkStart w:id="96" w:name="_Toc233127907"/>
+      <w:bookmarkStart w:id="93" w:name="_Toc233127907"/>
       <w:r>
         <w:rPr>
           <w:b/>
@@ -31503,7 +30817,7 @@
         </w:rPr>
         <w:t xml:space="preserve"> Class Diagram Sistem Pengecekan Stok dan Pengadaan Material</w:t>
       </w:r>
-      <w:bookmarkEnd w:id="96"/>
+      <w:bookmarkEnd w:id="93"/>
     </w:p>
     <w:p>
       <w:pPr>
@@ -31522,12 +30836,12 @@
       <w:pPr>
         <w:pStyle w:val="Heading1"/>
       </w:pPr>
-      <w:bookmarkStart w:id="97" w:name="_Toc234967040"/>
+      <w:bookmarkStart w:id="94" w:name="_Toc234967040"/>
       <w:r>
         <w:lastRenderedPageBreak/>
         <w:t>DAFTAR PUSTAKA</w:t>
       </w:r>
-      <w:bookmarkEnd w:id="97"/>
+      <w:bookmarkEnd w:id="94"/>
     </w:p>
     <w:p>
       <w:pPr>
@@ -31893,7 +31207,7 @@
       </w:r>
     </w:p>
     <w:sectPr>
-      <w:footerReference w:type="first" r:id="rId25"/>
+      <w:footerReference w:type="first" r:id="rId26"/>
       <w:pgSz w:w="11906" w:h="16838" w:code="9"/>
       <w:pgMar w:top="2268" w:right="1701" w:bottom="1701" w:left="2268" w:header="720" w:footer="720" w:gutter="0"/>
       <w:pgNumType w:start="1"/>
@@ -40829,7 +40143,7 @@
 </file>
 
 <file path=customXml/itemProps1.xml><?xml version="1.0" encoding="utf-8"?>
-<ds:datastoreItem xmlns:ds="http://schemas.openxmlformats.org/officeDocument/2006/customXml" ds:itemID="{5EBBEFFC-24F9-49DD-A71C-D19AC4E004AD}">
+<ds:datastoreItem xmlns:ds="http://schemas.openxmlformats.org/officeDocument/2006/customXml" ds:itemID="{53075B3C-D38B-4AC5-A5D5-846966796334}">
   <ds:schemaRefs>
     <ds:schemaRef ds:uri="http://schemas.openxmlformats.org/officeDocument/2006/bibliography"/>
   </ds:schemaRefs>

</xml_diff>